<commit_message>
doc(core): fix typo in handbook
</commit_message>
<xml_diff>
--- a/doc/PDFAS4_Dokumentation.docx
+++ b/doc/PDFAS4_Dokumentation.docx
@@ -34,7 +34,8 @@
           <w:p>
             <w:pPr>
               <w:pStyle w:val="NoSpacing"/>
-              <w:widowControl/>
+              <w:widowControl w:val="false"/>
+              <w:suppressAutoHyphens w:val="true"/>
               <w:spacing w:before="60" w:after="0"/>
               <w:ind w:left="0" w:right="0" w:hanging="0"/>
               <w:jc w:val="left"/>
@@ -45,12 +46,8 @@
             </w:pPr>
             <w:r>
               <w:rPr>
-                <w:rFonts w:eastAsia="" w:cs="" w:ascii="Century Gothic" w:hAnsi="Century Gothic"/>
-                <w:color w:val="4C483D"/>
-                <w:kern w:val="0"/>
-                <w:sz w:val="20"/>
-                <w:szCs w:val="20"/>
-                <w:lang w:val="en-US" w:eastAsia="ja-JP" w:bidi="ar-SA"/>
+                <w:rFonts w:asciiTheme="majorHAnsi" w:hAnsiTheme="majorHAnsi" w:ascii="Century Gothic" w:hAnsi="Century Gothic"/>
+                <w:sz w:val="18"/>
               </w:rPr>
               <mc:AlternateContent>
                 <mc:Choice Requires="wps">
@@ -170,11 +167,12 @@
           <w:p>
             <w:pPr>
               <w:pStyle w:val="NoSpacing"/>
-              <w:widowControl/>
+              <w:widowControl w:val="false"/>
               <w:tabs>
                 <w:tab w:val="clear" w:pos="720"/>
                 <w:tab w:val="left" w:pos="3297" w:leader="none"/>
               </w:tabs>
+              <w:suppressAutoHyphens w:val="true"/>
               <w:spacing w:before="60" w:after="0"/>
               <w:ind w:left="0" w:right="0" w:hanging="0"/>
               <w:jc w:val="center"/>
@@ -262,8 +260,8 @@
         <w:tblLook w:val="04a0" w:noHBand="0" w:noVBand="1" w:firstColumn="1" w:lastRow="0" w:lastColumn="0" w:firstRow="1"/>
       </w:tblPr>
       <w:tblGrid>
-        <w:gridCol w:w="283"/>
-        <w:gridCol w:w="8504"/>
+        <w:gridCol w:w="282"/>
+        <w:gridCol w:w="8505"/>
       </w:tblGrid>
       <w:tr>
         <w:trPr>
@@ -271,7 +269,7 @@
         </w:trPr>
         <w:tc>
           <w:tcPr>
-            <w:tcW w:w="283" w:type="dxa"/>
+            <w:tcW w:w="282" w:type="dxa"/>
             <w:tcBorders>
               <w:top w:val="nil"/>
               <w:left w:val="single" w:sz="4" w:space="0" w:color="E4E3E2"/>
@@ -282,7 +280,8 @@
           <w:p>
             <w:pPr>
               <w:pStyle w:val="Titel"/>
-              <w:widowControl/>
+              <w:widowControl w:val="false"/>
+              <w:suppressAutoHyphens w:val="true"/>
               <w:spacing w:before="120" w:after="0"/>
               <w:rPr>
                 <w:lang w:eastAsia="ja-JP" w:bidi="ar-SA"/>
@@ -297,7 +296,7 @@
         </w:tc>
         <w:tc>
           <w:tcPr>
-            <w:tcW w:w="8504" w:type="dxa"/>
+            <w:tcW w:w="8505" w:type="dxa"/>
             <w:tcBorders>
               <w:top w:val="nil"/>
               <w:left w:val="nil"/>
@@ -308,7 +307,8 @@
           <w:p>
             <w:pPr>
               <w:pStyle w:val="Titel"/>
-              <w:widowControl/>
+              <w:widowControl w:val="false"/>
+              <w:suppressAutoHyphens w:val="true"/>
               <w:spacing w:before="120" w:after="0"/>
               <w:rPr>
                 <w:lang w:eastAsia="ja-JP" w:bidi="ar-SA"/>
@@ -359,7 +359,7 @@
         </w:trPr>
         <w:tc>
           <w:tcPr>
-            <w:tcW w:w="283" w:type="dxa"/>
+            <w:tcW w:w="282" w:type="dxa"/>
             <w:tcBorders>
               <w:top w:val="nil"/>
               <w:left w:val="single" w:sz="4" w:space="0" w:color="E4E3E2"/>
@@ -370,7 +370,8 @@
           <w:p>
             <w:pPr>
               <w:pStyle w:val="Titel"/>
-              <w:widowControl/>
+              <w:widowControl w:val="false"/>
+              <w:suppressAutoHyphens w:val="true"/>
               <w:spacing w:before="120" w:after="0"/>
               <w:rPr>
                 <w:lang w:eastAsia="ja-JP" w:bidi="ar-SA"/>
@@ -385,7 +386,7 @@
         </w:tc>
         <w:tc>
           <w:tcPr>
-            <w:tcW w:w="8504" w:type="dxa"/>
+            <w:tcW w:w="8505" w:type="dxa"/>
             <w:tcBorders>
               <w:top w:val="nil"/>
               <w:left w:val="nil"/>
@@ -397,7 +398,8 @@
           <w:p>
             <w:pPr>
               <w:pStyle w:val="Untertitel"/>
-              <w:widowControl/>
+              <w:widowControl w:val="false"/>
+              <w:suppressAutoHyphens w:val="true"/>
               <w:spacing w:before="320" w:after="0"/>
               <w:rPr>
                 <w:rFonts w:eastAsia="" w:cs=""/>
@@ -423,7 +425,7 @@
         </w:trPr>
         <w:tc>
           <w:tcPr>
-            <w:tcW w:w="283" w:type="dxa"/>
+            <w:tcW w:w="282" w:type="dxa"/>
             <w:tcBorders>
               <w:top w:val="nil"/>
               <w:left w:val="single" w:sz="4" w:space="0" w:color="E4E3E2"/>
@@ -434,7 +436,8 @@
           <w:p>
             <w:pPr>
               <w:pStyle w:val="Titel"/>
-              <w:widowControl/>
+              <w:widowControl w:val="false"/>
+              <w:suppressAutoHyphens w:val="true"/>
               <w:spacing w:before="120" w:after="0"/>
               <w:rPr>
                 <w:lang w:eastAsia="ja-JP" w:bidi="ar-SA"/>
@@ -449,7 +452,7 @@
         </w:tc>
         <w:tc>
           <w:tcPr>
-            <w:tcW w:w="8504" w:type="dxa"/>
+            <w:tcW w:w="8505" w:type="dxa"/>
             <w:tcBorders>
               <w:top w:val="nil"/>
               <w:left w:val="nil"/>
@@ -461,7 +464,8 @@
           <w:p>
             <w:pPr>
               <w:pStyle w:val="Normal"/>
-              <w:widowControl/>
+              <w:widowControl w:val="false"/>
+              <w:suppressAutoHyphens w:val="true"/>
               <w:spacing w:lineRule="auto" w:line="240" w:before="0" w:after="0"/>
               <w:jc w:val="left"/>
               <w:rPr>
@@ -476,63 +480,7 @@
                 <w:kern w:val="0"/>
                 <w:lang w:eastAsia="ja-JP" w:bidi="ar-SA"/>
               </w:rPr>
-              <w:t>Version 1.</w:t>
-            </w:r>
-            <w:r>
-              <w:rPr>
-                <w:rFonts w:eastAsia="" w:cs=""/>
-                <w:kern w:val="0"/>
-                <w:lang w:eastAsia="ja-JP" w:bidi="ar-SA"/>
-              </w:rPr>
-              <w:t>1</w:t>
-            </w:r>
-            <w:r>
-              <w:rPr>
-                <w:rFonts w:eastAsia="" w:cs=""/>
-                <w:kern w:val="0"/>
-                <w:lang w:eastAsia="ja-JP" w:bidi="ar-SA"/>
-              </w:rPr>
-              <w:t xml:space="preserve">, </w:t>
-            </w:r>
-            <w:r>
-              <w:rPr>
-                <w:rFonts w:eastAsia="" w:cs=""/>
-                <w:kern w:val="0"/>
-                <w:lang w:eastAsia="ja-JP" w:bidi="ar-SA"/>
-              </w:rPr>
-              <w:t>03</w:t>
-            </w:r>
-            <w:r>
-              <w:rPr>
-                <w:rFonts w:eastAsia="" w:cs=""/>
-                <w:kern w:val="0"/>
-                <w:lang w:eastAsia="ja-JP" w:bidi="ar-SA"/>
-              </w:rPr>
-              <w:t>.</w:t>
-            </w:r>
-            <w:r>
-              <w:rPr>
-                <w:rFonts w:eastAsia="" w:cs=""/>
-                <w:kern w:val="0"/>
-                <w:lang w:eastAsia="ja-JP" w:bidi="ar-SA"/>
-              </w:rPr>
-              <w:t>03</w:t>
-            </w:r>
-            <w:r>
-              <w:rPr>
-                <w:rFonts w:eastAsia="" w:cs=""/>
-                <w:kern w:val="0"/>
-                <w:lang w:eastAsia="ja-JP" w:bidi="ar-SA"/>
-              </w:rPr>
-              <w:t>.202</w:t>
-            </w:r>
-            <w:r>
-              <w:rPr>
-                <w:rFonts w:eastAsia="" w:cs=""/>
-                <w:kern w:val="0"/>
-                <w:lang w:eastAsia="ja-JP" w:bidi="ar-SA"/>
-              </w:rPr>
-              <w:t>3</w:t>
+              <w:t>Version 1.1, 03.03.2023</w:t>
             </w:r>
           </w:p>
         </w:tc>
@@ -543,7 +491,7 @@
         </w:trPr>
         <w:tc>
           <w:tcPr>
-            <w:tcW w:w="283" w:type="dxa"/>
+            <w:tcW w:w="282" w:type="dxa"/>
             <w:tcBorders>
               <w:top w:val="nil"/>
               <w:left w:val="single" w:sz="4" w:space="0" w:color="E4E3E2"/>
@@ -554,7 +502,8 @@
           <w:p>
             <w:pPr>
               <w:pStyle w:val="Titel"/>
-              <w:widowControl/>
+              <w:widowControl w:val="false"/>
+              <w:suppressAutoHyphens w:val="true"/>
               <w:spacing w:before="120" w:after="0"/>
               <w:rPr>
                 <w:lang w:eastAsia="ja-JP" w:bidi="ar-SA"/>
@@ -569,7 +518,7 @@
         </w:tc>
         <w:tc>
           <w:tcPr>
-            <w:tcW w:w="8504" w:type="dxa"/>
+            <w:tcW w:w="8505" w:type="dxa"/>
             <w:tcBorders>
               <w:top w:val="nil"/>
               <w:left w:val="nil"/>
@@ -581,7 +530,8 @@
           <w:p>
             <w:pPr>
               <w:pStyle w:val="Titel"/>
-              <w:widowControl/>
+              <w:widowControl w:val="false"/>
+              <w:suppressAutoHyphens w:val="true"/>
               <w:spacing w:before="0" w:after="0"/>
               <w:jc w:val="left"/>
               <w:rPr>
@@ -594,14 +544,15 @@
               <w:rPr>
                 <w:sz w:val="22"/>
                 <w:szCs w:val="22"/>
-                <w:lang w:val="en-US" w:eastAsia="ja-JP" w:bidi="ar-SA"/>
+                <w:lang w:val="en-US"/>
               </w:rPr>
             </w:r>
           </w:p>
           <w:p>
             <w:pPr>
               <w:pStyle w:val="Normal"/>
-              <w:widowControl/>
+              <w:widowControl w:val="false"/>
+              <w:suppressAutoHyphens w:val="true"/>
               <w:spacing w:lineRule="auto" w:line="240" w:before="0" w:after="0"/>
               <w:rPr>
                 <w:lang w:val="en-US"/>
@@ -609,16 +560,15 @@
             </w:pPr>
             <w:r>
               <w:rPr>
-                <w:rFonts w:eastAsia="" w:cs=""/>
-                <w:kern w:val="0"/>
-                <w:lang w:val="en-US" w:eastAsia="ja-JP" w:bidi="ar-SA"/>
+                <w:lang w:val="en-US"/>
               </w:rPr>
             </w:r>
           </w:p>
           <w:p>
             <w:pPr>
               <w:pStyle w:val="Titel"/>
-              <w:widowControl/>
+              <w:widowControl w:val="false"/>
+              <w:suppressAutoHyphens w:val="true"/>
               <w:spacing w:before="0" w:after="0"/>
               <w:jc w:val="left"/>
               <w:rPr>
@@ -633,23 +583,7 @@
                 <w:szCs w:val="22"/>
                 <w:lang w:val="en-US" w:eastAsia="ja-JP" w:bidi="ar-SA"/>
               </w:rPr>
-              <w:t>Thomas Lenz</w:t>
-            </w:r>
-            <w:r>
-              <w:rPr>
-                <w:sz w:val="22"/>
-                <w:szCs w:val="22"/>
-                <w:lang w:val="en-US" w:eastAsia="ja-JP" w:bidi="ar-SA"/>
-              </w:rPr>
-              <w:t xml:space="preserve"> – </w:t>
-            </w:r>
-            <w:r>
-              <w:rPr>
-                <w:sz w:val="22"/>
-                <w:szCs w:val="22"/>
-                <w:lang w:val="en-US" w:eastAsia="ja-JP" w:bidi="ar-SA"/>
-              </w:rPr>
-              <w:t>thomas.lenz</w:t>
+              <w:t>Thomas Lenz – thomas.lenz</w:t>
             </w:r>
             <w:hyperlink r:id="rId3">
               <w:r>
@@ -671,7 +605,7 @@
         </w:trPr>
         <w:tc>
           <w:tcPr>
-            <w:tcW w:w="283" w:type="dxa"/>
+            <w:tcW w:w="282" w:type="dxa"/>
             <w:tcBorders>
               <w:top w:val="nil"/>
               <w:left w:val="single" w:sz="4" w:space="0" w:color="E4E3E2"/>
@@ -682,7 +616,8 @@
           <w:p>
             <w:pPr>
               <w:pStyle w:val="Titel"/>
-              <w:widowControl/>
+              <w:widowControl w:val="false"/>
+              <w:suppressAutoHyphens w:val="true"/>
               <w:spacing w:before="120" w:after="0"/>
               <w:rPr>
                 <w:lang w:val="en-US"/>
@@ -690,14 +625,14 @@
             </w:pPr>
             <w:r>
               <w:rPr>
-                <w:lang w:val="en-US" w:eastAsia="ja-JP" w:bidi="ar-SA"/>
+                <w:lang w:val="en-US"/>
               </w:rPr>
             </w:r>
           </w:p>
         </w:tc>
         <w:tc>
           <w:tcPr>
-            <w:tcW w:w="8504" w:type="dxa"/>
+            <w:tcW w:w="8505" w:type="dxa"/>
             <w:tcBorders>
               <w:top w:val="nil"/>
               <w:left w:val="nil"/>
@@ -708,7 +643,8 @@
           <w:p>
             <w:pPr>
               <w:pStyle w:val="Titel"/>
-              <w:widowControl/>
+              <w:widowControl w:val="false"/>
+              <w:suppressAutoHyphens w:val="true"/>
               <w:spacing w:before="120" w:after="0"/>
               <w:jc w:val="left"/>
               <w:rPr>
@@ -718,13 +654,17 @@
               </w:rPr>
             </w:pPr>
             <w:r>
-              <w:rPr/>
+              <w:rPr>
+                <w:sz w:val="22"/>
+                <w:szCs w:val="22"/>
+              </w:rPr>
             </w:r>
           </w:p>
           <w:p>
             <w:pPr>
               <w:pStyle w:val="Normal"/>
-              <w:widowControl/>
+              <w:widowControl w:val="false"/>
+              <w:suppressAutoHyphens w:val="true"/>
               <w:spacing w:lineRule="auto" w:line="240" w:before="0" w:after="0"/>
               <w:rPr>
                 <w:lang w:val="en-US"/>
@@ -732,9 +672,7 @@
             </w:pPr>
             <w:r>
               <w:rPr>
-                <w:rFonts w:eastAsia="" w:cs=""/>
-                <w:kern w:val="0"/>
-                <w:lang w:val="en-US" w:eastAsia="ja-JP" w:bidi="ar-SA"/>
+                <w:lang w:val="en-US"/>
               </w:rPr>
             </w:r>
           </w:p>
@@ -746,7 +684,7 @@
         </w:trPr>
         <w:tc>
           <w:tcPr>
-            <w:tcW w:w="283" w:type="dxa"/>
+            <w:tcW w:w="282" w:type="dxa"/>
             <w:tcBorders>
               <w:top w:val="nil"/>
               <w:left w:val="single" w:sz="4" w:space="0" w:color="E4E3E2"/>
@@ -757,7 +695,8 @@
           <w:p>
             <w:pPr>
               <w:pStyle w:val="Titel"/>
-              <w:widowControl/>
+              <w:widowControl w:val="false"/>
+              <w:suppressAutoHyphens w:val="true"/>
               <w:spacing w:before="120" w:after="0"/>
               <w:rPr>
                 <w:lang w:val="en-US"/>
@@ -765,14 +704,14 @@
             </w:pPr>
             <w:r>
               <w:rPr>
-                <w:lang w:val="en-US" w:eastAsia="ja-JP" w:bidi="ar-SA"/>
+                <w:lang w:val="en-US"/>
               </w:rPr>
             </w:r>
           </w:p>
         </w:tc>
         <w:tc>
           <w:tcPr>
-            <w:tcW w:w="8504" w:type="dxa"/>
+            <w:tcW w:w="8505" w:type="dxa"/>
             <w:tcBorders>
               <w:top w:val="nil"/>
               <w:left w:val="nil"/>
@@ -783,7 +722,8 @@
           <w:p>
             <w:pPr>
               <w:pStyle w:val="Titel"/>
-              <w:widowControl/>
+              <w:widowControl w:val="false"/>
+              <w:suppressAutoHyphens w:val="true"/>
               <w:spacing w:before="120" w:after="0"/>
               <w:jc w:val="left"/>
               <w:rPr>
@@ -796,7 +736,7 @@
               <w:rPr>
                 <w:sz w:val="22"/>
                 <w:szCs w:val="22"/>
-                <w:lang w:val="en-US" w:eastAsia="ja-JP" w:bidi="ar-SA"/>
+                <w:lang w:val="en-US"/>
               </w:rPr>
             </w:r>
           </w:p>
@@ -888,6 +828,7 @@
             <w:rPr>
               <w:webHidden/>
               <w:rStyle w:val="Verzeichnissprung"/>
+              <w:vanish w:val="false"/>
             </w:rPr>
             <w:instrText xml:space="preserve"> TOC \z \o "1-3" \u \h</w:instrText>
           </w:r>
@@ -895,6 +836,7 @@
             <w:rPr>
               <w:webHidden/>
               <w:rStyle w:val="Verzeichnissprung"/>
+              <w:vanish w:val="false"/>
             </w:rPr>
             <w:fldChar w:fldCharType="separate"/>
           </w:r>
@@ -902,33 +844,28 @@
             <w:r>
               <w:rPr>
                 <w:webHidden/>
-                <w:rStyle w:val="Verzeichnissprung"/>
-              </w:rPr>
-              <w:t>1 Kurzbeschreibung</w:t>
+              </w:rPr>
+              <w:fldChar w:fldCharType="begin"/>
             </w:r>
             <w:r>
               <w:rPr>
                 <w:webHidden/>
               </w:rPr>
-              <w:fldChar w:fldCharType="begin"/>
+              <w:instrText xml:space="preserve">PAGEREF _Toc490637480 \h</w:instrText>
             </w:r>
             <w:r>
               <w:rPr>
                 <w:webHidden/>
               </w:rPr>
-              <w:instrText xml:space="preserve">PAGEREF _Toc490637480 \h</w:instrText>
+              <w:fldChar w:fldCharType="separate"/>
             </w:r>
             <w:r>
               <w:rPr>
                 <w:webHidden/>
-              </w:rPr>
-              <w:fldChar w:fldCharType="separate"/>
-            </w:r>
-            <w:r>
-              <w:rPr>
                 <w:rStyle w:val="Verzeichnissprung"/>
                 <w:vanish w:val="false"/>
               </w:rPr>
+              <w:t>1 Kurzbeschreibung</w:t>
               <w:tab/>
               <w:t>3</w:t>
             </w:r>
@@ -957,33 +894,28 @@
             <w:r>
               <w:rPr>
                 <w:webHidden/>
-                <w:rStyle w:val="Verzeichnissprung"/>
-              </w:rPr>
-              <w:t>2 Anwendungsbeschreibung</w:t>
+              </w:rPr>
+              <w:fldChar w:fldCharType="begin"/>
             </w:r>
             <w:r>
               <w:rPr>
                 <w:webHidden/>
               </w:rPr>
-              <w:fldChar w:fldCharType="begin"/>
+              <w:instrText xml:space="preserve">PAGEREF _Toc490637481 \h</w:instrText>
             </w:r>
             <w:r>
               <w:rPr>
                 <w:webHidden/>
               </w:rPr>
-              <w:instrText xml:space="preserve">PAGEREF _Toc490637481 \h</w:instrText>
+              <w:fldChar w:fldCharType="separate"/>
             </w:r>
             <w:r>
               <w:rPr>
                 <w:webHidden/>
-              </w:rPr>
-              <w:fldChar w:fldCharType="separate"/>
-            </w:r>
-            <w:r>
-              <w:rPr>
                 <w:rStyle w:val="Verzeichnissprung"/>
                 <w:vanish w:val="false"/>
               </w:rPr>
+              <w:t>2 Anwendungsbeschreibung</w:t>
               <w:tab/>
               <w:t>4</w:t>
             </w:r>
@@ -1013,6 +945,7 @@
               <w:rPr>
                 <w:webHidden/>
                 <w:rStyle w:val="Verzeichnissprung"/>
+                <w:vanish w:val="false"/>
                 <w14:scene3d>
                   <w14:camera w14:prst="orthographicFront"/>
                   <w14:lightRig w14:rig="threePt" w14:dir="t">
@@ -1080,6 +1013,7 @@
               <w:rPr>
                 <w:webHidden/>
                 <w:rStyle w:val="Verzeichnissprung"/>
+                <w:vanish w:val="false"/>
                 <w14:scene3d>
                   <w14:camera w14:prst="orthographicFront"/>
                   <w14:lightRig w14:rig="threePt" w14:dir="t">
@@ -1147,6 +1081,7 @@
               <w:rPr>
                 <w:webHidden/>
                 <w:rStyle w:val="Verzeichnissprung"/>
+                <w:vanish w:val="false"/>
                 <w14:scene3d>
                   <w14:camera w14:prst="orthographicFront"/>
                   <w14:lightRig w14:rig="threePt" w14:dir="t">
@@ -1213,33 +1148,28 @@
             <w:r>
               <w:rPr>
                 <w:webHidden/>
-                <w:rStyle w:val="Verzeichnissprung"/>
-              </w:rPr>
-              <w:t>3 Konfiguration</w:t>
+              </w:rPr>
+              <w:fldChar w:fldCharType="begin"/>
             </w:r>
             <w:r>
               <w:rPr>
                 <w:webHidden/>
               </w:rPr>
-              <w:fldChar w:fldCharType="begin"/>
+              <w:instrText xml:space="preserve">PAGEREF _Toc490637485 \h</w:instrText>
             </w:r>
             <w:r>
               <w:rPr>
                 <w:webHidden/>
               </w:rPr>
-              <w:instrText xml:space="preserve">PAGEREF _Toc490637485 \h</w:instrText>
+              <w:fldChar w:fldCharType="separate"/>
             </w:r>
             <w:r>
               <w:rPr>
                 <w:webHidden/>
-              </w:rPr>
-              <w:fldChar w:fldCharType="separate"/>
-            </w:r>
-            <w:r>
-              <w:rPr>
                 <w:rStyle w:val="Verzeichnissprung"/>
                 <w:vanish w:val="false"/>
               </w:rPr>
+              <w:t>3 Konfiguration</w:t>
               <w:tab/>
               <w:t>8</w:t>
             </w:r>
@@ -1269,6 +1199,7 @@
               <w:rPr>
                 <w:webHidden/>
                 <w:rStyle w:val="Verzeichnissprung"/>
+                <w:vanish w:val="false"/>
                 <w14:scene3d>
                   <w14:camera w14:prst="orthographicFront"/>
                   <w14:lightRig w14:rig="threePt" w14:dir="t">
@@ -1336,6 +1267,7 @@
               <w:rPr>
                 <w:webHidden/>
                 <w:rStyle w:val="Verzeichnissprung"/>
+                <w:vanish w:val="false"/>
                 <w14:scene3d>
                   <w14:camera w14:prst="orthographicFront"/>
                   <w14:lightRig w14:rig="threePt" w14:dir="t">
@@ -1403,6 +1335,7 @@
               <w:rPr>
                 <w:webHidden/>
                 <w:rStyle w:val="Verzeichnissprung"/>
+                <w:vanish w:val="false"/>
                 <w14:scene3d>
                   <w14:camera w14:prst="orthographicFront"/>
                   <w14:lightRig w14:rig="threePt" w14:dir="t">
@@ -1470,6 +1403,7 @@
               <w:rPr>
                 <w:webHidden/>
                 <w:rStyle w:val="Verzeichnissprung"/>
+                <w:vanish w:val="false"/>
                 <w14:scene3d>
                   <w14:camera w14:prst="orthographicFront"/>
                   <w14:lightRig w14:rig="threePt" w14:dir="t">
@@ -1537,6 +1471,7 @@
               <w:rPr>
                 <w:webHidden/>
                 <w:rStyle w:val="Verzeichnissprung"/>
+                <w:vanish w:val="false"/>
                 <w14:scene3d>
                   <w14:camera w14:prst="orthographicFront"/>
                   <w14:lightRig w14:rig="threePt" w14:dir="t">
@@ -1604,6 +1539,7 @@
               <w:rPr>
                 <w:webHidden/>
                 <w:rStyle w:val="Verzeichnissprung"/>
+                <w:vanish w:val="false"/>
                 <w14:scene3d>
                   <w14:camera w14:prst="orthographicFront"/>
                   <w14:lightRig w14:rig="threePt" w14:dir="t">
@@ -1671,6 +1607,7 @@
               <w:rPr>
                 <w:webHidden/>
                 <w:rStyle w:val="Verzeichnissprung"/>
+                <w:vanish w:val="false"/>
                 <w14:scene3d>
                   <w14:camera w14:prst="orthographicFront"/>
                   <w14:lightRig w14:rig="threePt" w14:dir="t">
@@ -1738,6 +1675,7 @@
               <w:rPr>
                 <w:webHidden/>
                 <w:rStyle w:val="Verzeichnissprung"/>
+                <w:vanish w:val="false"/>
                 <w14:scene3d>
                   <w14:camera w14:prst="orthographicFront"/>
                   <w14:lightRig w14:rig="threePt" w14:dir="t">
@@ -1805,6 +1743,7 @@
               <w:rPr>
                 <w:webHidden/>
                 <w:rStyle w:val="Verzeichnissprung"/>
+                <w:vanish w:val="false"/>
                 <w14:scene3d>
                   <w14:camera w14:prst="orthographicFront"/>
                   <w14:lightRig w14:rig="threePt" w14:dir="t">
@@ -1872,6 +1811,7 @@
               <w:rPr>
                 <w:webHidden/>
                 <w:rStyle w:val="Verzeichnissprung"/>
+                <w:vanish w:val="false"/>
                 <w14:scene3d>
                   <w14:camera w14:prst="orthographicFront"/>
                   <w14:lightRig w14:rig="threePt" w14:dir="t">
@@ -1939,6 +1879,7 @@
               <w:rPr>
                 <w:webHidden/>
                 <w:rStyle w:val="Verzeichnissprung"/>
+                <w:vanish w:val="false"/>
                 <w14:scene3d>
                   <w14:camera w14:prst="orthographicFront"/>
                   <w14:lightRig w14:rig="threePt" w14:dir="t">
@@ -2006,6 +1947,7 @@
               <w:rPr>
                 <w:webHidden/>
                 <w:rStyle w:val="Verzeichnissprung"/>
+                <w:vanish w:val="false"/>
                 <w14:scene3d>
                   <w14:camera w14:prst="orthographicFront"/>
                   <w14:lightRig w14:rig="threePt" w14:dir="t">
@@ -2073,6 +2015,7 @@
               <w:rPr>
                 <w:webHidden/>
                 <w:rStyle w:val="Verzeichnissprung"/>
+                <w:vanish w:val="false"/>
                 <w14:scene3d>
                   <w14:camera w14:prst="orthographicFront"/>
                   <w14:lightRig w14:rig="threePt" w14:dir="t">
@@ -2140,6 +2083,7 @@
               <w:rPr>
                 <w:webHidden/>
                 <w:rStyle w:val="Verzeichnissprung"/>
+                <w:vanish w:val="false"/>
                 <w14:scene3d>
                   <w14:camera w14:prst="orthographicFront"/>
                   <w14:lightRig w14:rig="threePt" w14:dir="t">
@@ -2235,38 +2179,25 @@
     </w:p>
     <w:p>
       <w:pPr>
-        <w:pStyle w:val="Normal"/>
+        <w:pStyle w:val="Textkrper"/>
         <w:rPr/>
       </w:pPr>
       <w:r>
         <w:fldChar w:fldCharType="begin"/>
       </w:r>
       <w:r>
-        <w:rPr>
-          <w:b/>
-          <w:bCs/>
-        </w:rPr>
+        <w:rPr/>
         <w:instrText xml:space="preserve"> TOC \c "Abbildung" </w:instrText>
       </w:r>
       <w:r>
-        <w:rPr>
-          <w:b/>
-          <w:bCs/>
-        </w:rPr>
+        <w:rPr/>
         <w:fldChar w:fldCharType="separate"/>
       </w:r>
       <w:r>
-        <w:rPr>
-          <w:b/>
-          <w:bCs/>
-        </w:rPr>
-        <w:t>Es konnten keine Einträge für ein Abbildungsverzeichnis gefunden werden.</w:t>
-      </w:r>
-      <w:r>
-        <w:rPr>
-          <w:b/>
-          <w:bCs/>
-        </w:rPr>
+        <w:rPr/>
+      </w:r>
+      <w:r>
+        <w:rPr/>
         <w:fldChar w:fldCharType="end"/>
       </w:r>
     </w:p>
@@ -2287,9 +2218,9 @@
         <w:pStyle w:val="Berschrift1"/>
         <w:rPr/>
       </w:pPr>
-      <w:bookmarkStart w:id="0" w:name="_Toc490637480"/>
+      <w:bookmarkStart w:id="0" w:name="_Toc129153041"/>
       <w:bookmarkStart w:id="1" w:name="_Toc379351812"/>
-      <w:bookmarkStart w:id="2" w:name="_Toc129153041"/>
+      <w:bookmarkStart w:id="2" w:name="_Toc490637480"/>
       <w:r>
         <w:rPr/>
         <w:t>Kurzbeschreibung</w:t>
@@ -2326,9 +2257,9 @@
         <w:pStyle w:val="Berschrift1"/>
         <w:rPr/>
       </w:pPr>
-      <w:bookmarkStart w:id="3" w:name="_Toc490637481"/>
+      <w:bookmarkStart w:id="3" w:name="_Toc129153045"/>
       <w:bookmarkStart w:id="4" w:name="_Toc379351813"/>
-      <w:bookmarkStart w:id="5" w:name="_Toc129153045"/>
+      <w:bookmarkStart w:id="5" w:name="_Toc490637481"/>
       <w:r>
         <w:rPr/>
         <w:t>Anwendungsbeschreibung</w:t>
@@ -2421,8 +2352,8 @@
         <w:pStyle w:val="Berschrift2"/>
         <w:rPr/>
       </w:pPr>
-      <w:bookmarkStart w:id="6" w:name="_Toc490637482"/>
-      <w:bookmarkStart w:id="7" w:name="_Toc379351814"/>
+      <w:bookmarkStart w:id="6" w:name="_Toc379351814"/>
+      <w:bookmarkStart w:id="7" w:name="_Toc490637482"/>
       <w:r>
         <w:rPr/>
         <w:t>PDF-AS Java Bibliothek</w:t>
@@ -2742,8 +2673,8 @@
         <w:pStyle w:val="Berschrift2"/>
         <w:rPr/>
       </w:pPr>
-      <w:bookmarkStart w:id="8" w:name="_Toc490637483"/>
-      <w:bookmarkStart w:id="9" w:name="_Toc379351815"/>
+      <w:bookmarkStart w:id="8" w:name="_Toc379351815"/>
+      <w:bookmarkStart w:id="9" w:name="_Toc490637483"/>
       <w:r>
         <w:rPr/>
         <w:t>PDF-AS Kommandozeilen Anwendung</w:t>
@@ -4160,8 +4091,8 @@
         <w:pStyle w:val="Berschrift2"/>
         <w:rPr/>
       </w:pPr>
-      <w:bookmarkStart w:id="10" w:name="_Toc490637484"/>
-      <w:bookmarkStart w:id="11" w:name="_Toc379351816"/>
+      <w:bookmarkStart w:id="10" w:name="_Toc379351816"/>
+      <w:bookmarkStart w:id="11" w:name="_Toc490637484"/>
       <w:r>
         <w:rPr/>
         <w:t>PDF-AS Webanwendung</w:t>
@@ -4217,8 +4148,8 @@
         <w:pStyle w:val="Berschrift1"/>
         <w:rPr/>
       </w:pPr>
-      <w:bookmarkStart w:id="12" w:name="_Toc490637485"/>
-      <w:bookmarkStart w:id="13" w:name="_Toc379351817"/>
+      <w:bookmarkStart w:id="12" w:name="_Toc379351817"/>
+      <w:bookmarkStart w:id="13" w:name="_Toc490637485"/>
       <w:r>
         <w:rPr/>
         <w:t>Konfiguration</w:t>
@@ -4241,8 +4172,8 @@
         <w:pStyle w:val="Berschrift2"/>
         <w:rPr/>
       </w:pPr>
-      <w:bookmarkStart w:id="14" w:name="_Toc490637486"/>
-      <w:bookmarkStart w:id="15" w:name="_Toc379351818"/>
+      <w:bookmarkStart w:id="14" w:name="_Toc379351818"/>
+      <w:bookmarkStart w:id="15" w:name="_Toc490637486"/>
       <w:r>
         <w:rPr/>
         <w:t>Grundsätzliches</w:t>
@@ -4382,8 +4313,8 @@
         <w:pStyle w:val="Berschrift2"/>
         <w:rPr/>
       </w:pPr>
-      <w:bookmarkStart w:id="16" w:name="_Toc490637487"/>
-      <w:bookmarkStart w:id="17" w:name="_Toc379351819"/>
+      <w:bookmarkStart w:id="16" w:name="_Toc379351819"/>
+      <w:bookmarkStart w:id="17" w:name="_Toc490637487"/>
       <w:r>
         <w:rPr/>
         <w:t>Basiseinstellungen für die Anbindung an die Bürgerkartenumgebung (BKU)</w:t>
@@ -4448,8 +4379,8 @@
         <w:pStyle w:val="Berschrift2"/>
         <w:rPr/>
       </w:pPr>
-      <w:bookmarkStart w:id="18" w:name="_Toc490637488"/>
-      <w:bookmarkStart w:id="19" w:name="_Toc379351820"/>
+      <w:bookmarkStart w:id="18" w:name="_Toc379351820"/>
+      <w:bookmarkStart w:id="19" w:name="_Toc490637488"/>
       <w:r>
         <w:rPr/>
         <w:t>Basiseinstellungen für die Anbindung an MOA-SS und MOA SP</w:t>
@@ -4615,8 +4546,8 @@
         <w:pStyle w:val="Berschrift2"/>
         <w:rPr/>
       </w:pPr>
-      <w:bookmarkStart w:id="20" w:name="_Toc490637489"/>
-      <w:bookmarkStart w:id="21" w:name="_Toc379351821"/>
+      <w:bookmarkStart w:id="20" w:name="_Toc379351821"/>
+      <w:bookmarkStart w:id="21" w:name="_Toc490637489"/>
       <w:r>
         <w:rPr/>
         <w:t>Basiseinstellungen für die Anbindung von MOCCA Online</w:t>
@@ -4670,8 +4601,8 @@
         <w:pStyle w:val="Berschrift2"/>
         <w:rPr/>
       </w:pPr>
-      <w:bookmarkStart w:id="22" w:name="_Toc490637490"/>
-      <w:bookmarkStart w:id="23" w:name="_Toc379351822"/>
+      <w:bookmarkStart w:id="22" w:name="_Toc379351822"/>
+      <w:bookmarkStart w:id="23" w:name="_Toc490637490"/>
       <w:r>
         <w:rPr/>
         <w:t>Basiseinstellungen für die Anbindung der Handy Signatur</w:t>
@@ -4719,10 +4650,10 @@
         <w:pStyle w:val="Berschrift2"/>
         <w:rPr/>
       </w:pPr>
-      <w:bookmarkStart w:id="24" w:name="_Toc283915519"/>
-      <w:bookmarkStart w:id="25" w:name="_Toc379351823"/>
-      <w:bookmarkStart w:id="26" w:name="_Toc147482732"/>
-      <w:bookmarkStart w:id="27" w:name="_Toc490637491"/>
+      <w:bookmarkStart w:id="24" w:name="_Toc490637491"/>
+      <w:bookmarkStart w:id="25" w:name="_Toc147482732"/>
+      <w:bookmarkStart w:id="26" w:name="_Toc379351823"/>
+      <w:bookmarkStart w:id="27" w:name="_Toc283915519"/>
       <w:r>
         <w:rPr/>
         <w:t>Spezifikation der Signatur Blöcke</w:t>
@@ -4931,9 +4862,9 @@
         <w:pStyle w:val="Berschrift3"/>
         <w:rPr/>
       </w:pPr>
-      <w:bookmarkStart w:id="28" w:name="_Toc490637492"/>
+      <w:bookmarkStart w:id="28" w:name="_Toc147482733"/>
       <w:bookmarkStart w:id="29" w:name="_Toc283915520"/>
-      <w:bookmarkStart w:id="30" w:name="_Toc147482733"/>
+      <w:bookmarkStart w:id="30" w:name="_Toc490637492"/>
       <w:r>
         <w:rPr/>
         <w:t>Design des Signatur Blocks (Tabelle)</w:t>
@@ -5699,9 +5630,9 @@
         <w:pStyle w:val="Berschrift3"/>
         <w:rPr/>
       </w:pPr>
-      <w:bookmarkStart w:id="31" w:name="_Toc490637493"/>
+      <w:bookmarkStart w:id="31" w:name="_Toc147482735"/>
       <w:bookmarkStart w:id="32" w:name="_Toc283915522"/>
-      <w:bookmarkStart w:id="33" w:name="_Toc147482735"/>
+      <w:bookmarkStart w:id="33" w:name="_Toc490637493"/>
       <w:r>
         <w:rPr/>
         <w:t>Positionierung von Signaturblöcken</w:t>
@@ -5760,34 +5691,7 @@
           <w:rStyle w:val="Quelltext"/>
           <w:lang w:val="de-DE"/>
         </w:rPr>
-        <w:t>sigblock.placement.less.space.failing=</w:t>
-      </w:r>
-      <w:r>
-        <w:rPr>
-          <w:rStyle w:val="Quelltext"/>
-          <w:lang w:val="de-DE"/>
-        </w:rPr>
-        <w:t>true/</w:t>
-      </w:r>
-      <w:r>
-        <w:rPr>
-          <w:rStyle w:val="Quelltext"/>
-          <w:lang w:val="de-DE"/>
-        </w:rPr>
-        <w:t xml:space="preserve">false </w:t>
-      </w:r>
-      <w:r>
-        <w:rPr>
-          <w:rStyle w:val="Quelltext"/>
-          <w:lang w:val="de-DE"/>
-        </w:rPr>
-        <w:t>(Default: false)</w:t>
-      </w:r>
-      <w:r>
-        <w:rPr>
-          <w:rStyle w:val="Quelltext"/>
-          <w:lang w:val="de-DE"/>
-        </w:rPr>
+        <w:t>sigblock.placement.less.space.failing=true/false (Default: false)</w:t>
         <w:br/>
       </w:r>
       <w:r>
@@ -6974,8 +6878,8 @@
         <w:pStyle w:val="Berschrift3"/>
         <w:rPr/>
       </w:pPr>
-      <w:bookmarkStart w:id="35" w:name="_Toc490637494"/>
-      <w:bookmarkStart w:id="36" w:name="_Toc283915534"/>
+      <w:bookmarkStart w:id="35" w:name="_Toc283915534"/>
+      <w:bookmarkStart w:id="36" w:name="_Toc490637494"/>
       <w:r>
         <w:rPr/>
         <w:t>Dynamische Werte in der Signaturblockdefinition</w:t>
@@ -7100,10 +7004,10 @@
         <w:pStyle w:val="Berschrift2"/>
         <w:rPr/>
       </w:pPr>
-      <w:bookmarkStart w:id="37" w:name="_Toc283915527"/>
-      <w:bookmarkStart w:id="38" w:name="_Toc490637495"/>
-      <w:bookmarkStart w:id="39" w:name="_Ref379288511"/>
-      <w:bookmarkStart w:id="40" w:name="_Toc379351824"/>
+      <w:bookmarkStart w:id="37" w:name="_Toc379351824"/>
+      <w:bookmarkStart w:id="38" w:name="_Ref379288511"/>
+      <w:bookmarkStart w:id="39" w:name="_Toc490637495"/>
+      <w:bookmarkStart w:id="40" w:name="_Toc283915527"/>
       <w:r>
         <w:rPr/>
         <w:t>Signatur-Platzhalter im Dokument</w:t>
@@ -7128,8 +7032,8 @@
         <w:pStyle w:val="Berschrift3"/>
         <w:rPr/>
       </w:pPr>
-      <w:bookmarkStart w:id="41" w:name="_Toc490637496"/>
-      <w:bookmarkStart w:id="42" w:name="_Toc283915528"/>
+      <w:bookmarkStart w:id="41" w:name="_Toc283915528"/>
+      <w:bookmarkStart w:id="42" w:name="_Toc490637496"/>
       <w:r>
         <w:rPr/>
         <w:t>Aktivierung</w:t>
@@ -7202,8 +7106,8 @@
         <w:pStyle w:val="Berschrift3"/>
         <w:rPr/>
       </w:pPr>
-      <w:bookmarkStart w:id="43" w:name="_Toc490637497"/>
-      <w:bookmarkStart w:id="44" w:name="_Toc283915529"/>
+      <w:bookmarkStart w:id="43" w:name="_Toc283915529"/>
+      <w:bookmarkStart w:id="44" w:name="_Toc490637497"/>
       <w:r>
         <w:rPr/>
         <w:t>QR-Code Generierung</w:t>
@@ -7299,8 +7203,8 @@
         <w:pStyle w:val="Berschrift3"/>
         <w:rPr/>
       </w:pPr>
-      <w:bookmarkStart w:id="45" w:name="_Toc490637498"/>
-      <w:bookmarkStart w:id="46" w:name="_Toc283915530"/>
+      <w:bookmarkStart w:id="45" w:name="_Toc283915530"/>
+      <w:bookmarkStart w:id="46" w:name="_Toc490637498"/>
       <w:r>
         <w:rPr/>
         <w:t>Properties</w:t>
@@ -7600,7 +7504,7 @@
       </w:tblPr>
       <w:tblGrid>
         <w:gridCol w:w="1251"/>
-        <w:gridCol w:w="1698"/>
+        <w:gridCol w:w="1697"/>
         <w:gridCol w:w="2554"/>
         <w:gridCol w:w="3644"/>
       </w:tblGrid>
@@ -7620,7 +7524,8 @@
           <w:p>
             <w:pPr>
               <w:pStyle w:val="Tabellen"/>
-              <w:widowControl/>
+              <w:widowControl w:val="false"/>
+              <w:suppressAutoHyphens w:val="true"/>
               <w:spacing w:lineRule="auto" w:line="240" w:before="60" w:after="60"/>
               <w:rPr>
                 <w:color w:val="FFFFFF" w:themeColor="background1"/>
@@ -7639,7 +7544,7 @@
         </w:tc>
         <w:tc>
           <w:tcPr>
-            <w:tcW w:w="1698" w:type="dxa"/>
+            <w:tcW w:w="1697" w:type="dxa"/>
             <w:tcBorders>
               <w:bottom w:val="nil"/>
             </w:tcBorders>
@@ -7648,7 +7553,8 @@
           <w:p>
             <w:pPr>
               <w:pStyle w:val="Tabellen"/>
-              <w:widowControl/>
+              <w:widowControl w:val="false"/>
+              <w:suppressAutoHyphens w:val="true"/>
               <w:spacing w:lineRule="auto" w:line="240" w:before="60" w:after="60"/>
               <w:cnfStyle w:val="100000000000" w:firstRow="1" w:lastRow="0" w:firstColumn="0" w:lastColumn="0" w:oddVBand="0" w:evenVBand="0" w:oddHBand="0" w:evenHBand="0" w:firstRowFirstColumn="0" w:firstRowLastColumn="0" w:lastRowFirstColumn="0" w:lastRowLastColumn="0"/>
               <w:rPr>
@@ -7677,7 +7583,8 @@
           <w:p>
             <w:pPr>
               <w:pStyle w:val="Tabellen"/>
-              <w:widowControl/>
+              <w:widowControl w:val="false"/>
+              <w:suppressAutoHyphens w:val="true"/>
               <w:spacing w:lineRule="auto" w:line="240" w:before="60" w:after="60"/>
               <w:cnfStyle w:val="100000000000" w:firstRow="1" w:lastRow="0" w:firstColumn="0" w:lastColumn="0" w:oddVBand="0" w:evenVBand="0" w:oddHBand="0" w:evenHBand="0" w:firstRowFirstColumn="0" w:firstRowLastColumn="0" w:lastRowFirstColumn="0" w:lastRowLastColumn="0"/>
               <w:rPr>
@@ -7706,7 +7613,8 @@
           <w:p>
             <w:pPr>
               <w:pStyle w:val="Tabellen"/>
-              <w:widowControl/>
+              <w:widowControl w:val="false"/>
+              <w:suppressAutoHyphens w:val="true"/>
               <w:spacing w:lineRule="auto" w:line="240" w:before="60" w:after="60"/>
               <w:cnfStyle w:val="100000000000" w:firstRow="1" w:lastRow="0" w:firstColumn="0" w:lastColumn="0" w:oddVBand="0" w:evenVBand="0" w:oddHBand="0" w:evenHBand="0" w:firstRowFirstColumn="0" w:firstRowLastColumn="0" w:lastRowFirstColumn="0" w:lastRowLastColumn="0"/>
               <w:rPr>
@@ -7739,7 +7647,8 @@
           <w:p>
             <w:pPr>
               <w:pStyle w:val="Normal"/>
-              <w:widowControl/>
+              <w:widowControl w:val="false"/>
+              <w:suppressAutoHyphens w:val="true"/>
               <w:spacing w:lineRule="auto" w:line="240" w:before="60" w:after="60"/>
               <w:rPr>
                 <w:rFonts w:eastAsia="" w:cs=""/>
@@ -7759,7 +7668,7 @@
         </w:tc>
         <w:tc>
           <w:tcPr>
-            <w:tcW w:w="1698" w:type="dxa"/>
+            <w:tcW w:w="1697" w:type="dxa"/>
             <w:tcBorders>
               <w:top w:val="nil"/>
               <w:bottom w:val="nil"/>
@@ -7768,7 +7677,8 @@
           <w:p>
             <w:pPr>
               <w:pStyle w:val="Normal"/>
-              <w:widowControl/>
+              <w:widowControl w:val="false"/>
+              <w:suppressAutoHyphens w:val="true"/>
               <w:spacing w:lineRule="auto" w:line="240" w:before="60" w:after="60"/>
               <w:cnfStyle w:val="000000000000" w:firstRow="0" w:lastRow="0" w:firstColumn="0" w:lastColumn="0" w:oddVBand="0" w:evenVBand="0" w:oddHBand="0" w:evenHBand="0" w:firstRowFirstColumn="0" w:firstRowLastColumn="0" w:lastRowFirstColumn="0" w:lastRowLastColumn="0"/>
               <w:rPr>
@@ -7798,7 +7708,8 @@
           <w:p>
             <w:pPr>
               <w:pStyle w:val="Normal"/>
-              <w:widowControl/>
+              <w:widowControl w:val="false"/>
+              <w:suppressAutoHyphens w:val="true"/>
               <w:spacing w:lineRule="auto" w:line="240" w:before="60" w:after="60"/>
               <w:cnfStyle w:val="000000000000" w:firstRow="0" w:lastRow="0" w:firstColumn="0" w:lastColumn="0" w:oddVBand="0" w:evenVBand="0" w:oddHBand="0" w:evenHBand="0" w:firstRowFirstColumn="0" w:firstRowLastColumn="0" w:lastRowFirstColumn="0" w:lastRowLastColumn="0"/>
               <w:rPr>
@@ -7828,7 +7739,8 @@
           <w:p>
             <w:pPr>
               <w:pStyle w:val="Normal"/>
-              <w:widowControl/>
+              <w:widowControl w:val="false"/>
+              <w:suppressAutoHyphens w:val="true"/>
               <w:spacing w:lineRule="auto" w:line="240" w:before="60" w:after="60"/>
               <w:cnfStyle w:val="000000000000" w:firstRow="0" w:lastRow="0" w:firstColumn="0" w:lastColumn="0" w:oddVBand="0" w:evenVBand="0" w:oddHBand="0" w:evenHBand="0" w:firstRowFirstColumn="0" w:firstRowLastColumn="0" w:lastRowFirstColumn="0" w:lastRowLastColumn="0"/>
               <w:rPr>
@@ -7865,7 +7777,8 @@
           <w:p>
             <w:pPr>
               <w:pStyle w:val="Normal"/>
-              <w:widowControl/>
+              <w:widowControl w:val="false"/>
+              <w:suppressAutoHyphens w:val="true"/>
               <w:spacing w:lineRule="auto" w:line="240" w:before="60" w:after="60"/>
               <w:rPr>
                 <w:rFonts w:eastAsia="" w:cs=""/>
@@ -7885,7 +7798,7 @@
         </w:tc>
         <w:tc>
           <w:tcPr>
-            <w:tcW w:w="1698" w:type="dxa"/>
+            <w:tcW w:w="1697" w:type="dxa"/>
             <w:tcBorders>
               <w:top w:val="nil"/>
               <w:bottom w:val="nil"/>
@@ -7895,7 +7808,8 @@
           <w:p>
             <w:pPr>
               <w:pStyle w:val="Normal"/>
-              <w:widowControl/>
+              <w:widowControl w:val="false"/>
+              <w:suppressAutoHyphens w:val="true"/>
               <w:spacing w:lineRule="auto" w:line="240" w:before="60" w:after="60"/>
               <w:cnfStyle w:val="000000010000" w:firstRow="0" w:lastRow="0" w:firstColumn="0" w:lastColumn="0" w:oddVBand="0" w:evenVBand="0" w:oddHBand="0" w:evenHBand="1" w:firstRowFirstColumn="0" w:firstRowLastColumn="0" w:lastRowFirstColumn="0" w:lastRowLastColumn="0"/>
               <w:rPr>
@@ -7926,7 +7840,8 @@
           <w:p>
             <w:pPr>
               <w:pStyle w:val="Normal"/>
-              <w:widowControl/>
+              <w:widowControl w:val="false"/>
+              <w:suppressAutoHyphens w:val="true"/>
               <w:spacing w:lineRule="auto" w:line="240" w:before="60" w:after="60"/>
               <w:cnfStyle w:val="000000010000" w:firstRow="0" w:lastRow="0" w:firstColumn="0" w:lastColumn="0" w:oddVBand="0" w:evenVBand="0" w:oddHBand="0" w:evenHBand="1" w:firstRowFirstColumn="0" w:firstRowLastColumn="0" w:lastRowFirstColumn="0" w:lastRowLastColumn="0"/>
               <w:rPr>
@@ -7957,7 +7872,8 @@
           <w:p>
             <w:pPr>
               <w:pStyle w:val="Normal"/>
-              <w:widowControl/>
+              <w:widowControl w:val="false"/>
+              <w:suppressAutoHyphens w:val="true"/>
               <w:spacing w:lineRule="auto" w:line="240" w:before="60" w:after="60"/>
               <w:cnfStyle w:val="000000010000" w:firstRow="0" w:lastRow="0" w:firstColumn="0" w:lastColumn="0" w:oddVBand="0" w:evenVBand="0" w:oddHBand="0" w:evenHBand="1" w:firstRowFirstColumn="0" w:firstRowLastColumn="0" w:lastRowFirstColumn="0" w:lastRowLastColumn="0"/>
               <w:rPr>
@@ -7991,7 +7907,8 @@
           <w:p>
             <w:pPr>
               <w:pStyle w:val="Normal"/>
-              <w:widowControl/>
+              <w:widowControl w:val="false"/>
+              <w:suppressAutoHyphens w:val="true"/>
               <w:spacing w:lineRule="auto" w:line="240" w:before="60" w:after="60"/>
               <w:rPr>
                 <w:rFonts w:eastAsia="" w:cs=""/>
@@ -8011,7 +7928,7 @@
         </w:tc>
         <w:tc>
           <w:tcPr>
-            <w:tcW w:w="1698" w:type="dxa"/>
+            <w:tcW w:w="1697" w:type="dxa"/>
             <w:tcBorders>
               <w:top w:val="nil"/>
               <w:bottom w:val="nil"/>
@@ -8020,7 +7937,8 @@
           <w:p>
             <w:pPr>
               <w:pStyle w:val="Normal"/>
-              <w:widowControl/>
+              <w:widowControl w:val="false"/>
+              <w:suppressAutoHyphens w:val="true"/>
               <w:spacing w:lineRule="auto" w:line="240" w:before="60" w:after="60"/>
               <w:cnfStyle w:val="000000000000" w:firstRow="0" w:lastRow="0" w:firstColumn="0" w:lastColumn="0" w:oddVBand="0" w:evenVBand="0" w:oddHBand="0" w:evenHBand="0" w:firstRowFirstColumn="0" w:firstRowLastColumn="0" w:lastRowFirstColumn="0" w:lastRowLastColumn="0"/>
               <w:rPr>
@@ -8050,7 +7968,8 @@
           <w:p>
             <w:pPr>
               <w:pStyle w:val="Normal"/>
-              <w:widowControl/>
+              <w:widowControl w:val="false"/>
+              <w:suppressAutoHyphens w:val="true"/>
               <w:spacing w:lineRule="auto" w:line="240" w:before="60" w:after="60"/>
               <w:cnfStyle w:val="000000000000" w:firstRow="0" w:lastRow="0" w:firstColumn="0" w:lastColumn="0" w:oddVBand="0" w:evenVBand="0" w:oddHBand="0" w:evenHBand="0" w:firstRowFirstColumn="0" w:firstRowLastColumn="0" w:lastRowFirstColumn="0" w:lastRowLastColumn="0"/>
               <w:rPr>
@@ -8080,7 +7999,8 @@
           <w:p>
             <w:pPr>
               <w:pStyle w:val="Normal"/>
-              <w:widowControl/>
+              <w:widowControl w:val="false"/>
+              <w:suppressAutoHyphens w:val="true"/>
               <w:spacing w:lineRule="auto" w:line="240" w:before="60" w:after="60"/>
               <w:cnfStyle w:val="000000000000" w:firstRow="0" w:lastRow="0" w:firstColumn="0" w:lastColumn="0" w:oddVBand="0" w:evenVBand="0" w:oddHBand="0" w:evenHBand="0" w:firstRowFirstColumn="0" w:firstRowLastColumn="0" w:lastRowFirstColumn="0" w:lastRowLastColumn="0"/>
               <w:rPr>
@@ -8117,7 +8037,8 @@
           <w:p>
             <w:pPr>
               <w:pStyle w:val="Normal"/>
-              <w:widowControl/>
+              <w:widowControl w:val="false"/>
+              <w:suppressAutoHyphens w:val="true"/>
               <w:spacing w:lineRule="auto" w:line="240" w:before="60" w:after="60"/>
               <w:rPr>
                 <w:rFonts w:eastAsia="" w:cs=""/>
@@ -8137,7 +8058,7 @@
         </w:tc>
         <w:tc>
           <w:tcPr>
-            <w:tcW w:w="1698" w:type="dxa"/>
+            <w:tcW w:w="1697" w:type="dxa"/>
             <w:tcBorders>
               <w:top w:val="nil"/>
               <w:bottom w:val="nil"/>
@@ -8147,7 +8068,8 @@
           <w:p>
             <w:pPr>
               <w:pStyle w:val="Normal"/>
-              <w:widowControl/>
+              <w:widowControl w:val="false"/>
+              <w:suppressAutoHyphens w:val="true"/>
               <w:spacing w:lineRule="auto" w:line="240" w:before="60" w:after="60"/>
               <w:cnfStyle w:val="000000010000" w:firstRow="0" w:lastRow="0" w:firstColumn="0" w:lastColumn="0" w:oddVBand="0" w:evenVBand="0" w:oddHBand="0" w:evenHBand="1" w:firstRowFirstColumn="0" w:firstRowLastColumn="0" w:lastRowFirstColumn="0" w:lastRowLastColumn="0"/>
               <w:rPr>
@@ -8178,7 +8100,8 @@
           <w:p>
             <w:pPr>
               <w:pStyle w:val="Normal"/>
-              <w:widowControl/>
+              <w:widowControl w:val="false"/>
+              <w:suppressAutoHyphens w:val="true"/>
               <w:spacing w:lineRule="auto" w:line="240" w:before="60" w:after="60"/>
               <w:cnfStyle w:val="000000010000" w:firstRow="0" w:lastRow="0" w:firstColumn="0" w:lastColumn="0" w:oddVBand="0" w:evenVBand="0" w:oddHBand="0" w:evenHBand="1" w:firstRowFirstColumn="0" w:firstRowLastColumn="0" w:lastRowFirstColumn="0" w:lastRowLastColumn="0"/>
               <w:rPr>
@@ -8209,7 +8132,8 @@
           <w:p>
             <w:pPr>
               <w:pStyle w:val="Normal"/>
-              <w:widowControl/>
+              <w:widowControl w:val="false"/>
+              <w:suppressAutoHyphens w:val="true"/>
               <w:spacing w:lineRule="auto" w:line="240" w:before="60" w:after="60"/>
               <w:cnfStyle w:val="000000010000" w:firstRow="0" w:lastRow="0" w:firstColumn="0" w:lastColumn="0" w:oddVBand="0" w:evenVBand="0" w:oddHBand="0" w:evenHBand="1" w:firstRowFirstColumn="0" w:firstRowLastColumn="0" w:lastRowFirstColumn="0" w:lastRowLastColumn="0"/>
               <w:rPr>
@@ -8243,7 +8167,8 @@
           <w:p>
             <w:pPr>
               <w:pStyle w:val="Normal"/>
-              <w:widowControl/>
+              <w:widowControl w:val="false"/>
+              <w:suppressAutoHyphens w:val="true"/>
               <w:spacing w:lineRule="auto" w:line="240" w:before="60" w:after="60"/>
               <w:rPr>
                 <w:rFonts w:eastAsia="" w:cs=""/>
@@ -8263,7 +8188,7 @@
         </w:tc>
         <w:tc>
           <w:tcPr>
-            <w:tcW w:w="1698" w:type="dxa"/>
+            <w:tcW w:w="1697" w:type="dxa"/>
             <w:tcBorders>
               <w:top w:val="nil"/>
               <w:bottom w:val="nil"/>
@@ -8272,7 +8197,8 @@
           <w:p>
             <w:pPr>
               <w:pStyle w:val="Normal"/>
-              <w:widowControl/>
+              <w:widowControl w:val="false"/>
+              <w:suppressAutoHyphens w:val="true"/>
               <w:spacing w:lineRule="auto" w:line="240" w:before="60" w:after="60"/>
               <w:cnfStyle w:val="000000000000" w:firstRow="0" w:lastRow="0" w:firstColumn="0" w:lastColumn="0" w:oddVBand="0" w:evenVBand="0" w:oddHBand="0" w:evenHBand="0" w:firstRowFirstColumn="0" w:firstRowLastColumn="0" w:lastRowFirstColumn="0" w:lastRowLastColumn="0"/>
               <w:rPr>
@@ -8302,7 +8228,8 @@
           <w:p>
             <w:pPr>
               <w:pStyle w:val="Normal"/>
-              <w:widowControl/>
+              <w:widowControl w:val="false"/>
+              <w:suppressAutoHyphens w:val="true"/>
               <w:spacing w:lineRule="auto" w:line="240" w:before="60" w:after="60"/>
               <w:cnfStyle w:val="000000000000" w:firstRow="0" w:lastRow="0" w:firstColumn="0" w:lastColumn="0" w:oddVBand="0" w:evenVBand="0" w:oddHBand="0" w:evenHBand="0" w:firstRowFirstColumn="0" w:firstRowLastColumn="0" w:lastRowFirstColumn="0" w:lastRowLastColumn="0"/>
               <w:rPr>
@@ -8332,7 +8259,8 @@
           <w:p>
             <w:pPr>
               <w:pStyle w:val="Normal"/>
-              <w:widowControl/>
+              <w:widowControl w:val="false"/>
+              <w:suppressAutoHyphens w:val="true"/>
               <w:spacing w:lineRule="auto" w:line="240" w:before="60" w:after="60"/>
               <w:cnfStyle w:val="000000000000" w:firstRow="0" w:lastRow="0" w:firstColumn="0" w:lastColumn="0" w:oddVBand="0" w:evenVBand="0" w:oddHBand="0" w:evenHBand="0" w:firstRowFirstColumn="0" w:firstRowLastColumn="0" w:lastRowFirstColumn="0" w:lastRowLastColumn="0"/>
               <w:rPr>
@@ -8369,7 +8297,8 @@
           <w:p>
             <w:pPr>
               <w:pStyle w:val="Normal"/>
-              <w:widowControl/>
+              <w:widowControl w:val="false"/>
+              <w:suppressAutoHyphens w:val="true"/>
               <w:spacing w:lineRule="auto" w:line="240" w:before="60" w:after="60"/>
               <w:rPr>
                 <w:rFonts w:eastAsia="" w:cs=""/>
@@ -8389,7 +8318,7 @@
         </w:tc>
         <w:tc>
           <w:tcPr>
-            <w:tcW w:w="1698" w:type="dxa"/>
+            <w:tcW w:w="1697" w:type="dxa"/>
             <w:tcBorders>
               <w:top w:val="nil"/>
               <w:bottom w:val="nil"/>
@@ -8399,7 +8328,8 @@
           <w:p>
             <w:pPr>
               <w:pStyle w:val="Normal"/>
-              <w:widowControl/>
+              <w:widowControl w:val="false"/>
+              <w:suppressAutoHyphens w:val="true"/>
               <w:spacing w:lineRule="auto" w:line="240" w:before="60" w:after="60"/>
               <w:cnfStyle w:val="000000010000" w:firstRow="0" w:lastRow="0" w:firstColumn="0" w:lastColumn="0" w:oddVBand="0" w:evenVBand="0" w:oddHBand="0" w:evenHBand="1" w:firstRowFirstColumn="0" w:firstRowLastColumn="0" w:lastRowFirstColumn="0" w:lastRowLastColumn="0"/>
               <w:rPr>
@@ -8430,7 +8360,8 @@
           <w:p>
             <w:pPr>
               <w:pStyle w:val="Normal"/>
-              <w:widowControl/>
+              <w:widowControl w:val="false"/>
+              <w:suppressAutoHyphens w:val="true"/>
               <w:spacing w:lineRule="auto" w:line="240" w:before="60" w:after="60"/>
               <w:cnfStyle w:val="000000010000" w:firstRow="0" w:lastRow="0" w:firstColumn="0" w:lastColumn="0" w:oddVBand="0" w:evenVBand="0" w:oddHBand="0" w:evenHBand="1" w:firstRowFirstColumn="0" w:firstRowLastColumn="0" w:lastRowFirstColumn="0" w:lastRowLastColumn="0"/>
               <w:rPr>
@@ -8461,7 +8392,8 @@
           <w:p>
             <w:pPr>
               <w:pStyle w:val="Normal"/>
-              <w:widowControl/>
+              <w:widowControl w:val="false"/>
+              <w:suppressAutoHyphens w:val="true"/>
               <w:spacing w:lineRule="auto" w:line="240" w:before="60" w:after="60"/>
               <w:cnfStyle w:val="000000010000" w:firstRow="0" w:lastRow="0" w:firstColumn="0" w:lastColumn="0" w:oddVBand="0" w:evenVBand="0" w:oddHBand="0" w:evenHBand="1" w:firstRowFirstColumn="0" w:firstRowLastColumn="0" w:lastRowFirstColumn="0" w:lastRowLastColumn="0"/>
               <w:rPr>
@@ -8495,7 +8427,8 @@
           <w:p>
             <w:pPr>
               <w:pStyle w:val="Normal"/>
-              <w:widowControl/>
+              <w:widowControl w:val="false"/>
+              <w:suppressAutoHyphens w:val="true"/>
               <w:spacing w:lineRule="auto" w:line="240" w:before="60" w:after="60"/>
               <w:rPr>
                 <w:rFonts w:eastAsia="" w:cs=""/>
@@ -8515,7 +8448,7 @@
         </w:tc>
         <w:tc>
           <w:tcPr>
-            <w:tcW w:w="1698" w:type="dxa"/>
+            <w:tcW w:w="1697" w:type="dxa"/>
             <w:tcBorders>
               <w:top w:val="nil"/>
               <w:bottom w:val="nil"/>
@@ -8524,7 +8457,8 @@
           <w:p>
             <w:pPr>
               <w:pStyle w:val="Normal"/>
-              <w:widowControl/>
+              <w:widowControl w:val="false"/>
+              <w:suppressAutoHyphens w:val="true"/>
               <w:spacing w:lineRule="auto" w:line="240" w:before="60" w:after="60"/>
               <w:cnfStyle w:val="000000000000" w:firstRow="0" w:lastRow="0" w:firstColumn="0" w:lastColumn="0" w:oddVBand="0" w:evenVBand="0" w:oddHBand="0" w:evenHBand="0" w:firstRowFirstColumn="0" w:firstRowLastColumn="0" w:lastRowFirstColumn="0" w:lastRowLastColumn="0"/>
               <w:rPr>
@@ -8554,7 +8488,8 @@
           <w:p>
             <w:pPr>
               <w:pStyle w:val="Normal"/>
-              <w:widowControl/>
+              <w:widowControl w:val="false"/>
+              <w:suppressAutoHyphens w:val="true"/>
               <w:spacing w:lineRule="auto" w:line="240" w:before="60" w:after="60"/>
               <w:cnfStyle w:val="000000000000" w:firstRow="0" w:lastRow="0" w:firstColumn="0" w:lastColumn="0" w:oddVBand="0" w:evenVBand="0" w:oddHBand="0" w:evenHBand="0" w:firstRowFirstColumn="0" w:firstRowLastColumn="0" w:lastRowFirstColumn="0" w:lastRowLastColumn="0"/>
               <w:rPr>
@@ -8584,7 +8519,8 @@
           <w:p>
             <w:pPr>
               <w:pStyle w:val="Normal"/>
-              <w:widowControl/>
+              <w:widowControl w:val="false"/>
+              <w:suppressAutoHyphens w:val="true"/>
               <w:spacing w:lineRule="auto" w:line="240" w:before="60" w:after="60"/>
               <w:cnfStyle w:val="000000000000" w:firstRow="0" w:lastRow="0" w:firstColumn="0" w:lastColumn="0" w:oddVBand="0" w:evenVBand="0" w:oddHBand="0" w:evenHBand="0" w:firstRowFirstColumn="0" w:firstRowLastColumn="0" w:lastRowFirstColumn="0" w:lastRowLastColumn="0"/>
               <w:rPr>
@@ -8621,7 +8557,8 @@
           <w:p>
             <w:pPr>
               <w:pStyle w:val="Normal"/>
-              <w:widowControl/>
+              <w:widowControl w:val="false"/>
+              <w:suppressAutoHyphens w:val="true"/>
               <w:spacing w:lineRule="auto" w:line="240" w:before="60" w:after="60"/>
               <w:rPr>
                 <w:rFonts w:eastAsia="" w:cs=""/>
@@ -8641,7 +8578,7 @@
         </w:tc>
         <w:tc>
           <w:tcPr>
-            <w:tcW w:w="1698" w:type="dxa"/>
+            <w:tcW w:w="1697" w:type="dxa"/>
             <w:tcBorders>
               <w:top w:val="nil"/>
               <w:bottom w:val="nil"/>
@@ -8651,7 +8588,8 @@
           <w:p>
             <w:pPr>
               <w:pStyle w:val="Normal"/>
-              <w:widowControl/>
+              <w:widowControl w:val="false"/>
+              <w:suppressAutoHyphens w:val="true"/>
               <w:spacing w:lineRule="auto" w:line="240" w:before="60" w:after="60"/>
               <w:cnfStyle w:val="000000010000" w:firstRow="0" w:lastRow="0" w:firstColumn="0" w:lastColumn="0" w:oddVBand="0" w:evenVBand="0" w:oddHBand="0" w:evenHBand="1" w:firstRowFirstColumn="0" w:firstRowLastColumn="0" w:lastRowFirstColumn="0" w:lastRowLastColumn="0"/>
               <w:rPr>
@@ -8682,7 +8620,8 @@
           <w:p>
             <w:pPr>
               <w:pStyle w:val="Normal"/>
-              <w:widowControl/>
+              <w:widowControl w:val="false"/>
+              <w:suppressAutoHyphens w:val="true"/>
               <w:spacing w:lineRule="auto" w:line="240" w:before="60" w:after="60"/>
               <w:cnfStyle w:val="000000010000" w:firstRow="0" w:lastRow="0" w:firstColumn="0" w:lastColumn="0" w:oddVBand="0" w:evenVBand="0" w:oddHBand="0" w:evenHBand="1" w:firstRowFirstColumn="0" w:firstRowLastColumn="0" w:lastRowFirstColumn="0" w:lastRowLastColumn="0"/>
               <w:rPr>
@@ -8713,7 +8652,8 @@
           <w:p>
             <w:pPr>
               <w:pStyle w:val="Normal"/>
-              <w:widowControl/>
+              <w:widowControl w:val="false"/>
+              <w:suppressAutoHyphens w:val="true"/>
               <w:spacing w:lineRule="auto" w:line="240" w:before="60" w:after="60"/>
               <w:cnfStyle w:val="000000010000" w:firstRow="0" w:lastRow="0" w:firstColumn="0" w:lastColumn="0" w:oddVBand="0" w:evenVBand="0" w:oddHBand="0" w:evenHBand="1" w:firstRowFirstColumn="0" w:firstRowLastColumn="0" w:lastRowFirstColumn="0" w:lastRowLastColumn="0"/>
               <w:rPr>
@@ -8747,7 +8687,8 @@
           <w:p>
             <w:pPr>
               <w:pStyle w:val="Normal"/>
-              <w:widowControl/>
+              <w:widowControl w:val="false"/>
+              <w:suppressAutoHyphens w:val="true"/>
               <w:spacing w:lineRule="auto" w:line="240" w:before="60" w:after="60"/>
               <w:rPr>
                 <w:rFonts w:eastAsia="" w:cs=""/>
@@ -8767,7 +8708,7 @@
         </w:tc>
         <w:tc>
           <w:tcPr>
-            <w:tcW w:w="1698" w:type="dxa"/>
+            <w:tcW w:w="1697" w:type="dxa"/>
             <w:tcBorders>
               <w:top w:val="nil"/>
               <w:bottom w:val="nil"/>
@@ -8776,7 +8717,8 @@
           <w:p>
             <w:pPr>
               <w:pStyle w:val="Normal"/>
-              <w:widowControl/>
+              <w:widowControl w:val="false"/>
+              <w:suppressAutoHyphens w:val="true"/>
               <w:spacing w:lineRule="auto" w:line="240" w:before="60" w:after="60"/>
               <w:cnfStyle w:val="000000000000" w:firstRow="0" w:lastRow="0" w:firstColumn="0" w:lastColumn="0" w:oddVBand="0" w:evenVBand="0" w:oddHBand="0" w:evenHBand="0" w:firstRowFirstColumn="0" w:firstRowLastColumn="0" w:lastRowFirstColumn="0" w:lastRowLastColumn="0"/>
               <w:rPr>
@@ -8806,7 +8748,8 @@
           <w:p>
             <w:pPr>
               <w:pStyle w:val="Normal"/>
-              <w:widowControl/>
+              <w:widowControl w:val="false"/>
+              <w:suppressAutoHyphens w:val="true"/>
               <w:spacing w:lineRule="auto" w:line="240" w:before="60" w:after="60"/>
               <w:cnfStyle w:val="000000000000" w:firstRow="0" w:lastRow="0" w:firstColumn="0" w:lastColumn="0" w:oddVBand="0" w:evenVBand="0" w:oddHBand="0" w:evenHBand="0" w:firstRowFirstColumn="0" w:firstRowLastColumn="0" w:lastRowFirstColumn="0" w:lastRowLastColumn="0"/>
               <w:rPr>
@@ -8836,7 +8779,8 @@
           <w:p>
             <w:pPr>
               <w:pStyle w:val="Normal"/>
-              <w:widowControl/>
+              <w:widowControl w:val="false"/>
+              <w:suppressAutoHyphens w:val="true"/>
               <w:spacing w:lineRule="auto" w:line="240" w:before="60" w:after="60"/>
               <w:cnfStyle w:val="000000000000" w:firstRow="0" w:lastRow="0" w:firstColumn="0" w:lastColumn="0" w:oddVBand="0" w:evenVBand="0" w:oddHBand="0" w:evenHBand="0" w:firstRowFirstColumn="0" w:firstRowLastColumn="0" w:lastRowFirstColumn="0" w:lastRowLastColumn="0"/>
               <w:rPr>
@@ -8865,11 +8809,13 @@
             <w:tcBorders>
               <w:top w:val="nil"/>
             </w:tcBorders>
+            <w:shd w:color="auto" w:fill="DDDBD5" w:themeFill="text2" w:themeFillTint="33" w:val="clear"/>
           </w:tcPr>
           <w:p>
             <w:pPr>
               <w:pStyle w:val="Normal"/>
-              <w:widowControl/>
+              <w:widowControl w:val="false"/>
+              <w:suppressAutoHyphens w:val="true"/>
               <w:spacing w:lineRule="auto" w:line="240" w:before="60" w:after="60"/>
               <w:rPr>
                 <w:rFonts w:eastAsia="" w:cs=""/>
@@ -8889,15 +8835,17 @@
         </w:tc>
         <w:tc>
           <w:tcPr>
-            <w:tcW w:w="1698" w:type="dxa"/>
+            <w:tcW w:w="1697" w:type="dxa"/>
             <w:tcBorders>
               <w:top w:val="nil"/>
             </w:tcBorders>
+            <w:shd w:color="auto" w:fill="DDDBD5" w:themeFill="text2" w:themeFillTint="33" w:val="clear"/>
           </w:tcPr>
           <w:p>
             <w:pPr>
               <w:pStyle w:val="Normal"/>
-              <w:widowControl/>
+              <w:widowControl w:val="false"/>
+              <w:suppressAutoHyphens w:val="true"/>
               <w:spacing w:lineRule="auto" w:line="240" w:before="60" w:after="60"/>
               <w:cnfStyle w:val="000000000000" w:firstRow="0" w:lastRow="0" w:firstColumn="0" w:lastColumn="0" w:oddVBand="0" w:evenVBand="0" w:oddHBand="0" w:evenHBand="0" w:firstRowFirstColumn="0" w:firstRowLastColumn="0" w:lastRowFirstColumn="0" w:lastRowLastColumn="0"/>
               <w:rPr>
@@ -8922,11 +8870,13 @@
             <w:tcBorders>
               <w:top w:val="nil"/>
             </w:tcBorders>
+            <w:shd w:color="auto" w:fill="DDDBD5" w:themeFill="text2" w:themeFillTint="33" w:val="clear"/>
           </w:tcPr>
           <w:p>
             <w:pPr>
               <w:pStyle w:val="Normal"/>
-              <w:widowControl/>
+              <w:widowControl w:val="false"/>
+              <w:suppressAutoHyphens w:val="true"/>
               <w:spacing w:lineRule="auto" w:line="240" w:before="60" w:after="60"/>
               <w:cnfStyle w:val="000000000000" w:firstRow="0" w:lastRow="0" w:firstColumn="0" w:lastColumn="0" w:oddVBand="0" w:evenVBand="0" w:oddHBand="0" w:evenHBand="0" w:firstRowFirstColumn="0" w:firstRowLastColumn="0" w:lastRowFirstColumn="0" w:lastRowLastColumn="0"/>
               <w:rPr>
@@ -8951,11 +8901,13 @@
             <w:tcBorders>
               <w:top w:val="nil"/>
             </w:tcBorders>
+            <w:shd w:color="auto" w:fill="DDDBD5" w:themeFill="text2" w:themeFillTint="33" w:val="clear"/>
           </w:tcPr>
           <w:p>
             <w:pPr>
               <w:pStyle w:val="Normal"/>
-              <w:widowControl/>
+              <w:widowControl w:val="false"/>
+              <w:suppressAutoHyphens w:val="true"/>
               <w:spacing w:lineRule="auto" w:line="240" w:before="60" w:after="60"/>
               <w:cnfStyle w:val="000000000000" w:firstRow="0" w:lastRow="0" w:firstColumn="0" w:lastColumn="0" w:oddVBand="0" w:evenVBand="0" w:oddHBand="0" w:evenHBand="0" w:firstRowFirstColumn="0" w:firstRowLastColumn="0" w:lastRowFirstColumn="0" w:lastRowLastColumn="0"/>
               <w:rPr>
@@ -9062,7 +9014,8 @@
           <w:p>
             <w:pPr>
               <w:pStyle w:val="Normal"/>
-              <w:widowControl/>
+              <w:widowControl w:val="false"/>
+              <w:suppressAutoHyphens w:val="true"/>
               <w:spacing w:lineRule="auto" w:line="240" w:before="0" w:after="0"/>
               <w:rPr>
                 <w:rFonts w:eastAsia="" w:cs=""/>
@@ -9108,7 +9061,8 @@
           <w:p>
             <w:pPr>
               <w:pStyle w:val="Normal"/>
-              <w:widowControl/>
+              <w:widowControl w:val="false"/>
+              <w:suppressAutoHyphens w:val="true"/>
               <w:spacing w:lineRule="auto" w:line="240" w:before="0" w:after="0"/>
               <w:rPr>
                 <w:rFonts w:eastAsia="" w:cs=""/>
@@ -9139,7 +9093,8 @@
           <w:p>
             <w:pPr>
               <w:pStyle w:val="Normal"/>
-              <w:widowControl/>
+              <w:widowControl w:val="false"/>
+              <w:suppressAutoHyphens w:val="true"/>
               <w:spacing w:lineRule="auto" w:line="240" w:before="0" w:after="0"/>
               <w:rPr>
                 <w:rFonts w:eastAsia="" w:cs=""/>
@@ -9183,7 +9138,8 @@
           <w:p>
             <w:pPr>
               <w:pStyle w:val="Normal"/>
-              <w:widowControl/>
+              <w:widowControl w:val="false"/>
+              <w:suppressAutoHyphens w:val="true"/>
               <w:spacing w:lineRule="auto" w:line="240" w:before="0" w:after="0"/>
               <w:rPr>
                 <w:lang w:val="en-US"/>
@@ -9241,7 +9197,7 @@
       <mc:AlternateContent>
         <mc:Choice Requires="wps">
           <w:drawing>
-            <wp:anchor behindDoc="1" distT="0" distB="0" distL="0" distR="0" simplePos="0" locked="0" layoutInCell="0" allowOverlap="1" relativeHeight="44" wp14:anchorId="055AE194">
+            <wp:anchor behindDoc="1" distT="0" distB="0" distL="0" distR="0" simplePos="0" locked="0" layoutInCell="0" allowOverlap="1" relativeHeight="42" wp14:anchorId="055AE194">
               <wp:simplePos x="0" y="0"/>
               <wp:positionH relativeFrom="margin">
                 <wp:align>left</wp:align>
@@ -9352,7 +9308,7 @@
                                 </w:r>
                                 <w:r>
                                   <w:rPr/>
-                                  <w:t>22</w:t>
+                                  <w:t>2</w:t>
                                 </w:r>
                                 <w:r>
                                   <w:rPr/>
@@ -9465,7 +9421,7 @@
                           </w:r>
                           <w:r>
                             <w:rPr/>
-                            <w:t>22</w:t>
+                            <w:t>2</w:t>
                           </w:r>
                           <w:r>
                             <w:rPr/>
@@ -9544,7 +9500,8 @@
         <w:p>
           <w:pPr>
             <w:pStyle w:val="Name"/>
-            <w:widowControl/>
+            <w:widowControl w:val="false"/>
+            <w:suppressAutoHyphens w:val="true"/>
             <w:spacing w:before="60" w:after="60"/>
             <w:ind w:left="0" w:right="144" w:hanging="0"/>
             <w:rPr>
@@ -9563,7 +9520,8 @@
         <w:p>
           <w:pPr>
             <w:pStyle w:val="NoSpacing"/>
-            <w:widowControl/>
+            <w:widowControl w:val="false"/>
+            <w:suppressAutoHyphens w:val="true"/>
             <w:ind w:left="0" w:right="0" w:hanging="0"/>
             <w:jc w:val="left"/>
             <w:rPr>
@@ -9622,7 +9580,8 @@
         <w:p>
           <w:pPr>
             <w:pStyle w:val="Name"/>
-            <w:widowControl/>
+            <w:widowControl w:val="false"/>
+            <w:suppressAutoHyphens w:val="true"/>
             <w:spacing w:before="60" w:after="60"/>
             <w:ind w:left="144" w:right="144" w:hanging="0"/>
             <w:jc w:val="right"/>
@@ -9665,7 +9624,8 @@
         <w:p>
           <w:pPr>
             <w:pStyle w:val="Name"/>
-            <w:widowControl/>
+            <w:widowControl w:val="false"/>
+            <w:suppressAutoHyphens w:val="true"/>
             <w:ind w:left="144" w:right="144" w:hanging="0"/>
             <w:jc w:val="right"/>
             <w:rPr>
@@ -9697,7 +9657,8 @@
         <w:p>
           <w:pPr>
             <w:pStyle w:val="Name"/>
-            <w:widowControl/>
+            <w:widowControl w:val="false"/>
+            <w:suppressAutoHyphens w:val="true"/>
             <w:spacing w:before="60" w:after="60"/>
             <w:ind w:left="144" w:right="144" w:hanging="0"/>
             <w:jc w:val="right"/>
@@ -9725,10 +9686,7 @@
             <w:br/>
           </w:r>
           <w:r>
-            <w:rPr>
-              <w:kern w:val="0"/>
-              <w:lang w:eastAsia="ja-JP" w:bidi="ar-SA"/>
-            </w:rPr>
+            <w:rPr/>
             <w:drawing>
               <wp:inline distT="0" distB="0" distL="0" distR="0">
                 <wp:extent cx="2762250" cy="255905"/>
@@ -9776,10 +9734,7 @@
             <w:br/>
           </w:r>
           <w:r>
-            <w:rPr>
-              <w:kern w:val="0"/>
-              <w:lang w:eastAsia="ja-JP" w:bidi="ar-SA"/>
-            </w:rPr>
+            <w:rPr/>
             <w:drawing>
               <wp:inline distT="0" distB="0" distL="0" distR="0">
                 <wp:extent cx="1014730" cy="496570"/>
@@ -9874,6 +9829,7 @@
         <w:vertAlign w:val="baseline"/>
         <w:position w:val="0"/>
         <w:sz w:val="20"/>
+        <w:sz w:val="20"/>
         <w:spacing w:val="0"/>
         <w:i w:val="false"/>
         <w:shadow w:val="false"/>
@@ -9934,6 +9890,7 @@
         <w:strike w:val="false"/>
         <w:vertAlign w:val="baseline"/>
         <w:position w:val="0"/>
+        <w:sz w:val="20"/>
         <w:sz w:val="20"/>
         <w:spacing w:val="0"/>
         <w:i w:val="false"/>
@@ -10082,6 +10039,7 @@
         </w:tabs>
         <w:ind w:left="1080" w:hanging="360"/>
       </w:pPr>
+      <w:rPr/>
     </w:lvl>
     <w:lvl w:ilvl="2">
       <w:start w:val="1"/>
@@ -10094,6 +10052,7 @@
         </w:tabs>
         <w:ind w:left="1440" w:hanging="360"/>
       </w:pPr>
+      <w:rPr/>
     </w:lvl>
     <w:lvl w:ilvl="3">
       <w:start w:val="1"/>
@@ -10106,6 +10065,7 @@
         </w:tabs>
         <w:ind w:left="1800" w:hanging="360"/>
       </w:pPr>
+      <w:rPr/>
     </w:lvl>
     <w:lvl w:ilvl="4">
       <w:start w:val="1"/>
@@ -10118,6 +10078,7 @@
         </w:tabs>
         <w:ind w:left="2160" w:hanging="360"/>
       </w:pPr>
+      <w:rPr/>
     </w:lvl>
     <w:lvl w:ilvl="5">
       <w:start w:val="1"/>
@@ -10130,6 +10091,7 @@
         </w:tabs>
         <w:ind w:left="2520" w:hanging="360"/>
       </w:pPr>
+      <w:rPr/>
     </w:lvl>
     <w:lvl w:ilvl="6">
       <w:start w:val="1"/>
@@ -10142,6 +10104,7 @@
         </w:tabs>
         <w:ind w:left="2880" w:hanging="360"/>
       </w:pPr>
+      <w:rPr/>
     </w:lvl>
     <w:lvl w:ilvl="7">
       <w:start w:val="1"/>
@@ -10154,6 +10117,7 @@
         </w:tabs>
         <w:ind w:left="3240" w:hanging="360"/>
       </w:pPr>
+      <w:rPr/>
     </w:lvl>
     <w:lvl w:ilvl="8">
       <w:start w:val="1"/>
@@ -10166,6 +10130,7 @@
         </w:tabs>
         <w:ind w:left="3600" w:hanging="360"/>
       </w:pPr>
+      <w:rPr/>
     </w:lvl>
   </w:abstractNum>
   <w:abstractNum w:abstractNumId="3">
@@ -10979,12 +10944,13 @@
     <w:rsid w:val="00835d6c"/>
     <w:pPr>
       <w:widowControl/>
+      <w:suppressAutoHyphens w:val="true"/>
       <w:bidi w:val="0"/>
       <w:spacing w:lineRule="auto" w:line="300" w:before="0" w:after="320"/>
       <w:jc w:val="both"/>
     </w:pPr>
     <w:rPr>
-      <w:rFonts w:ascii="Century Gothic" w:hAnsi="Century Gothic" w:asciiTheme="majorHAnsi" w:hAnsiTheme="majorHAnsi" w:eastAsia="" w:cs=""/>
+      <w:rFonts w:ascii="Century Gothic" w:hAnsi="Century Gothic" w:eastAsia="" w:cs="" w:asciiTheme="majorHAnsi" w:hAnsiTheme="majorHAnsi"/>
       <w:color w:val="000000" w:themeColor="text1"/>
       <w:kern w:val="0"/>
       <w:sz w:val="22"/>
@@ -11741,6 +11707,7 @@
     <w:qFormat/>
     <w:pPr>
       <w:widowControl/>
+      <w:suppressAutoHyphens w:val="true"/>
       <w:bidi w:val="0"/>
       <w:spacing w:lineRule="auto" w:line="240" w:before="60" w:after="0"/>
       <w:jc w:val="left"/>
@@ -12157,6 +12124,7 @@
     <w:rsid w:val="00e746b5"/>
     <w:pPr>
       <w:widowControl/>
+      <w:suppressAutoHyphens w:val="true"/>
       <w:bidi w:val="0"/>
       <w:spacing w:lineRule="auto" w:line="240" w:before="0" w:after="0"/>
       <w:ind w:right="-992" w:hanging="0"/>

</xml_diff>

<commit_message>
feat(core): add new page position parameter 'last'
</commit_message>
<xml_diff>
--- a/doc/PDFAS4_Dokumentation.docx
+++ b/doc/PDFAS4_Dokumentation.docx
@@ -500,7 +500,7 @@
                 <w:kern w:val="0"/>
                 <w:lang w:eastAsia="ja-JP" w:bidi="ar-SA"/>
               </w:rPr>
-              <w:t>Version 1.</w:t>
+              <w:t>Version 1.2.</w:t>
             </w:r>
             <w:r>
               <w:rPr>
@@ -508,7 +508,7 @@
                 <w:kern w:val="0"/>
                 <w:lang w:eastAsia="ja-JP" w:bidi="ar-SA"/>
               </w:rPr>
-              <w:t>2</w:t>
+              <w:t>1</w:t>
             </w:r>
             <w:r>
               <w:rPr>
@@ -524,7 +524,7 @@
                 <w:kern w:val="0"/>
                 <w:lang w:eastAsia="ja-JP" w:bidi="ar-SA"/>
               </w:rPr>
-              <w:t>20</w:t>
+              <w:t>12</w:t>
             </w:r>
             <w:r>
               <w:rPr>
@@ -540,7 +540,7 @@
                 <w:kern w:val="0"/>
                 <w:lang w:eastAsia="ja-JP" w:bidi="ar-SA"/>
               </w:rPr>
-              <w:t>12</w:t>
+              <w:t>03</w:t>
             </w:r>
             <w:r>
               <w:rPr>
@@ -548,7 +548,15 @@
                 <w:kern w:val="0"/>
                 <w:lang w:eastAsia="ja-JP" w:bidi="ar-SA"/>
               </w:rPr>
-              <w:t>.2023</w:t>
+              <w:t>.202</w:t>
+            </w:r>
+            <w:r>
+              <w:rPr>
+                <w:rFonts w:eastAsia="" w:cs=""/>
+                <w:kern w:val="0"/>
+                <w:lang w:eastAsia="ja-JP" w:bidi="ar-SA"/>
+              </w:rPr>
+              <w:t>4</w:t>
             </w:r>
           </w:p>
         </w:tc>
@@ -2271,9 +2279,9 @@
         <w:pStyle w:val="Berschrift1"/>
         <w:rPr/>
       </w:pPr>
-      <w:bookmarkStart w:id="0" w:name="_Toc490637480"/>
-      <w:bookmarkStart w:id="1" w:name="_Toc379351812"/>
-      <w:bookmarkStart w:id="2" w:name="_Toc129153041"/>
+      <w:bookmarkStart w:id="0" w:name="_Toc379351812"/>
+      <w:bookmarkStart w:id="1" w:name="_Toc129153041"/>
+      <w:bookmarkStart w:id="2" w:name="_Toc490637480"/>
       <w:r>
         <w:rPr/>
         <w:t>Kurzbeschreibung</w:t>
@@ -2310,9 +2318,9 @@
         <w:pStyle w:val="Berschrift1"/>
         <w:rPr/>
       </w:pPr>
-      <w:bookmarkStart w:id="3" w:name="_Toc490637481"/>
+      <w:bookmarkStart w:id="3" w:name="_Toc129153045"/>
       <w:bookmarkStart w:id="4" w:name="_Toc379351813"/>
-      <w:bookmarkStart w:id="5" w:name="_Toc129153045"/>
+      <w:bookmarkStart w:id="5" w:name="_Toc490637481"/>
       <w:r>
         <w:rPr/>
         <w:t>Anwendungsbeschreibung</w:t>
@@ -2405,8 +2413,8 @@
         <w:pStyle w:val="Berschrift2"/>
         <w:rPr/>
       </w:pPr>
-      <w:bookmarkStart w:id="6" w:name="_Toc490637482"/>
-      <w:bookmarkStart w:id="7" w:name="_Toc379351814"/>
+      <w:bookmarkStart w:id="6" w:name="_Toc379351814"/>
+      <w:bookmarkStart w:id="7" w:name="_Toc490637482"/>
       <w:r>
         <w:rPr/>
         <w:t>PDF-AS Java Bibliothek</w:t>
@@ -2726,8 +2734,8 @@
         <w:pStyle w:val="Berschrift2"/>
         <w:rPr/>
       </w:pPr>
-      <w:bookmarkStart w:id="8" w:name="_Toc490637483"/>
-      <w:bookmarkStart w:id="9" w:name="_Toc379351815"/>
+      <w:bookmarkStart w:id="8" w:name="_Toc379351815"/>
+      <w:bookmarkStart w:id="9" w:name="_Toc490637483"/>
       <w:r>
         <w:rPr/>
         <w:t>PDF-AS Kommandozeilen Anwendung</w:t>
@@ -3505,7 +3513,19 @@
               <w:rPr>
                 <w:lang w:val="de-DE"/>
               </w:rPr>
-              <w:t xml:space="preserve">p_algo: „auto“, „new“, </w:t>
+              <w:t>p_algo: „auto“, „new“, „</w:t>
+            </w:r>
+            <w:r>
+              <w:rPr>
+                <w:lang w:val="de-DE"/>
+              </w:rPr>
+              <w:t>last“,</w:t>
+            </w:r>
+            <w:r>
+              <w:rPr>
+                <w:lang w:val="de-DE"/>
+              </w:rPr>
+              <w:t xml:space="preserve"> </w:t>
             </w:r>
             <w:r>
               <w:rPr>
@@ -4144,8 +4164,8 @@
         <w:pStyle w:val="Berschrift2"/>
         <w:rPr/>
       </w:pPr>
-      <w:bookmarkStart w:id="10" w:name="_Toc490637484"/>
-      <w:bookmarkStart w:id="11" w:name="_Toc379351816"/>
+      <w:bookmarkStart w:id="10" w:name="_Toc379351816"/>
+      <w:bookmarkStart w:id="11" w:name="_Toc490637484"/>
       <w:r>
         <w:rPr/>
         <w:t>PDF-AS Webanwendung</w:t>
@@ -4201,8 +4221,8 @@
         <w:pStyle w:val="Berschrift1"/>
         <w:rPr/>
       </w:pPr>
-      <w:bookmarkStart w:id="12" w:name="_Toc490637485"/>
-      <w:bookmarkStart w:id="13" w:name="_Toc379351817"/>
+      <w:bookmarkStart w:id="12" w:name="_Toc379351817"/>
+      <w:bookmarkStart w:id="13" w:name="_Toc490637485"/>
       <w:r>
         <w:rPr/>
         <w:t>Konfiguration</w:t>
@@ -4225,8 +4245,8 @@
         <w:pStyle w:val="Berschrift2"/>
         <w:rPr/>
       </w:pPr>
-      <w:bookmarkStart w:id="14" w:name="_Toc490637486"/>
-      <w:bookmarkStart w:id="15" w:name="_Toc379351818"/>
+      <w:bookmarkStart w:id="14" w:name="_Toc379351818"/>
+      <w:bookmarkStart w:id="15" w:name="_Toc490637486"/>
       <w:r>
         <w:rPr/>
         <w:t>Grundsätzliches</w:t>
@@ -4366,8 +4386,8 @@
         <w:pStyle w:val="Berschrift2"/>
         <w:rPr/>
       </w:pPr>
-      <w:bookmarkStart w:id="16" w:name="_Toc490637487"/>
-      <w:bookmarkStart w:id="17" w:name="_Toc379351819"/>
+      <w:bookmarkStart w:id="16" w:name="_Toc379351819"/>
+      <w:bookmarkStart w:id="17" w:name="_Toc490637487"/>
       <w:r>
         <w:rPr/>
         <w:t>Basiseinstellungen für die Anbindung an die Bürgerkartenumgebung (BKU)</w:t>
@@ -4432,8 +4452,8 @@
         <w:pStyle w:val="Berschrift2"/>
         <w:rPr/>
       </w:pPr>
-      <w:bookmarkStart w:id="18" w:name="_Toc490637488"/>
-      <w:bookmarkStart w:id="19" w:name="_Toc379351820"/>
+      <w:bookmarkStart w:id="18" w:name="_Toc379351820"/>
+      <w:bookmarkStart w:id="19" w:name="_Toc490637488"/>
       <w:r>
         <w:rPr/>
         <w:t>Basiseinstellungen für die Anbindung an MOA-SS und MOA SP</w:t>
@@ -4599,8 +4619,8 @@
         <w:pStyle w:val="Berschrift2"/>
         <w:rPr/>
       </w:pPr>
-      <w:bookmarkStart w:id="20" w:name="_Toc490637489"/>
-      <w:bookmarkStart w:id="21" w:name="_Toc379351821"/>
+      <w:bookmarkStart w:id="20" w:name="_Toc379351821"/>
+      <w:bookmarkStart w:id="21" w:name="_Toc490637489"/>
       <w:r>
         <w:rPr/>
         <w:t>Basiseinstellungen für die Anbindung von MOCCA Online</w:t>
@@ -4654,8 +4674,8 @@
         <w:pStyle w:val="Berschrift2"/>
         <w:rPr/>
       </w:pPr>
-      <w:bookmarkStart w:id="22" w:name="_Toc490637490"/>
-      <w:bookmarkStart w:id="23" w:name="_Toc379351822"/>
+      <w:bookmarkStart w:id="22" w:name="_Toc379351822"/>
+      <w:bookmarkStart w:id="23" w:name="_Toc490637490"/>
       <w:r>
         <w:rPr/>
         <w:t>Basiseinstellungen für die Anbindung der Handy Signatur</w:t>
@@ -4703,8 +4723,8 @@
         <w:pStyle w:val="Berschrift2"/>
         <w:rPr/>
       </w:pPr>
-      <w:bookmarkStart w:id="24" w:name="_Toc283915519"/>
-      <w:bookmarkStart w:id="25" w:name="_Toc379351823"/>
+      <w:bookmarkStart w:id="24" w:name="_Toc379351823"/>
+      <w:bookmarkStart w:id="25" w:name="_Toc283915519"/>
       <w:bookmarkStart w:id="26" w:name="_Toc147482732"/>
       <w:bookmarkStart w:id="27" w:name="_Toc490637491"/>
       <w:r>
@@ -4915,9 +4935,9 @@
         <w:pStyle w:val="Berschrift3"/>
         <w:rPr/>
       </w:pPr>
-      <w:bookmarkStart w:id="28" w:name="_Toc490637492"/>
+      <w:bookmarkStart w:id="28" w:name="_Toc147482733"/>
       <w:bookmarkStart w:id="29" w:name="_Toc283915520"/>
-      <w:bookmarkStart w:id="30" w:name="_Toc147482733"/>
+      <w:bookmarkStart w:id="30" w:name="_Toc490637492"/>
       <w:r>
         <w:rPr/>
         <w:t>Design des Signatur Blocks (Tabelle)</w:t>
@@ -5683,9 +5703,9 @@
         <w:pStyle w:val="Berschrift3"/>
         <w:rPr/>
       </w:pPr>
-      <w:bookmarkStart w:id="31" w:name="_Toc490637493"/>
+      <w:bookmarkStart w:id="31" w:name="_Toc147482735"/>
       <w:bookmarkStart w:id="32" w:name="_Toc283915522"/>
-      <w:bookmarkStart w:id="33" w:name="_Toc147482735"/>
+      <w:bookmarkStart w:id="33" w:name="_Toc490637493"/>
       <w:r>
         <w:rPr/>
         <w:t>Positionierung von Signaturblöcken</w:t>
@@ -6112,6 +6132,51 @@
     <w:p>
       <w:pPr>
         <w:pStyle w:val="Normal"/>
+        <w:widowControl/>
+        <w:suppressAutoHyphens w:val="true"/>
+        <w:bidi w:val="0"/>
+        <w:spacing w:lineRule="auto" w:line="300" w:before="0" w:after="320"/>
+        <w:ind w:left="2835" w:right="0" w:hanging="2324"/>
+        <w:jc w:val="both"/>
+        <w:rPr>
+          <w:i/>
+          <w:i/>
+        </w:rPr>
+      </w:pPr>
+      <w:r>
+        <w:rPr>
+          <w:i/>
+        </w:rPr>
+        <w:t xml:space="preserve"> </w:t>
+      </w:r>
+      <w:r>
+        <w:rPr>
+          <w:i/>
+        </w:rPr>
+        <w:t xml:space="preserve">p_algo :=  'auto' ... Automatisch </w:t>
+      </w:r>
+      <w:r>
+        <w:rPr>
+          <w:i/>
+        </w:rPr>
+        <w:t>(</w:t>
+      </w:r>
+      <w:r>
+        <w:rPr>
+          <w:i/>
+        </w:rPr>
+        <w:t xml:space="preserve">letzte Seite </w:t>
+      </w:r>
+      <w:r>
+        <w:rPr>
+          <w:i/>
+        </w:rPr>
+        <w:t>oder neue Seite die letzte Seite zu wenig freie Fläche aufweist)</w:t>
+      </w:r>
+    </w:p>
+    <w:p>
+      <w:pPr>
+        <w:pStyle w:val="Normal"/>
         <w:ind w:left="425" w:hanging="0"/>
         <w:rPr>
           <w:i/>
@@ -6122,13 +6187,13 @@
         <w:rPr>
           <w:i/>
         </w:rPr>
-        <w:t xml:space="preserve"> </w:t>
-      </w:r>
-      <w:r>
-        <w:rPr>
-          <w:i/>
-        </w:rPr>
-        <w:t>p_algo :=  'auto' ... Automatisch letzte Seite</w:t>
+        <w:t xml:space="preserve">        </w:t>
+      </w:r>
+      <w:r>
+        <w:rPr>
+          <w:i/>
+        </w:rPr>
+        <w:t>:=  'new'  ... Neue Seite am Ende des Dokumentes</w:t>
       </w:r>
     </w:p>
     <w:p>
@@ -6150,7 +6215,25 @@
         <w:rPr>
           <w:i/>
         </w:rPr>
-        <w:t>:=  'new'  ... Neue Seite am Ende des Dokumentes</w:t>
+        <w:t>:=  '</w:t>
+      </w:r>
+      <w:r>
+        <w:rPr>
+          <w:i/>
+        </w:rPr>
+        <w:t>last</w:t>
+      </w:r>
+      <w:r>
+        <w:rPr>
+          <w:i/>
+        </w:rPr>
+        <w:t xml:space="preserve">'  ... </w:t>
+      </w:r>
+      <w:r>
+        <w:rPr>
+          <w:i/>
+        </w:rPr>
+        <w:t>Letzte Seite des Dokuments</w:t>
       </w:r>
     </w:p>
     <w:p>
@@ -6567,6 +6650,126 @@
           <w:i/>
           <w:lang w:val="en-US"/>
         </w:rPr>
+        <w:t>-pos “x:</w:t>
+      </w:r>
+      <w:r>
+        <w:rPr>
+          <w:i/>
+          <w:lang w:val="en-US"/>
+        </w:rPr>
+        <w:t>auto</w:t>
+      </w:r>
+      <w:r>
+        <w:rPr>
+          <w:i/>
+          <w:lang w:val="en-US"/>
+        </w:rPr>
+        <w:t>;y:10.0;w:</w:t>
+      </w:r>
+      <w:r>
+        <w:rPr>
+          <w:i/>
+          <w:lang w:val="en-US"/>
+        </w:rPr>
+        <w:t>auto</w:t>
+      </w:r>
+      <w:r>
+        <w:rPr>
+          <w:i/>
+          <w:lang w:val="en-US"/>
+        </w:rPr>
+        <w:t>;p:</w:t>
+      </w:r>
+      <w:r>
+        <w:rPr>
+          <w:i/>
+          <w:lang w:val="en-US"/>
+        </w:rPr>
+        <w:t>last</w:t>
+      </w:r>
+      <w:r>
+        <w:rPr>
+          <w:i/>
+          <w:lang w:val="en-US"/>
+        </w:rPr>
+        <w:t>”</w:t>
+      </w:r>
+    </w:p>
+    <w:p>
+      <w:pPr>
+        <w:pStyle w:val="Normal"/>
+        <w:ind w:left="425" w:hanging="0"/>
+        <w:rPr>
+          <w:i/>
+          <w:i/>
+          <w:lang w:val="en-US"/>
+        </w:rPr>
+      </w:pPr>
+      <w:r>
+        <w:rPr>
+          <w:i/>
+          <w:lang w:val="en-US"/>
+        </w:rPr>
+        <w:t>-pos “x:</w:t>
+      </w:r>
+      <w:r>
+        <w:rPr>
+          <w:i/>
+          <w:lang w:val="en-US"/>
+        </w:rPr>
+        <w:t>auto</w:t>
+      </w:r>
+      <w:r>
+        <w:rPr>
+          <w:i/>
+          <w:lang w:val="en-US"/>
+        </w:rPr>
+        <w:t>;y:</w:t>
+      </w:r>
+      <w:r>
+        <w:rPr>
+          <w:i/>
+          <w:lang w:val="en-US"/>
+        </w:rPr>
+        <w:t>auto</w:t>
+      </w:r>
+      <w:r>
+        <w:rPr>
+          <w:i/>
+          <w:lang w:val="en-US"/>
+        </w:rPr>
+        <w:t>;p:</w:t>
+      </w:r>
+      <w:r>
+        <w:rPr>
+          <w:i/>
+          <w:lang w:val="en-US"/>
+        </w:rPr>
+        <w:t>last</w:t>
+      </w:r>
+      <w:r>
+        <w:rPr>
+          <w:i/>
+          <w:lang w:val="en-US"/>
+        </w:rPr>
+        <w:t>”</w:t>
+      </w:r>
+    </w:p>
+    <w:p>
+      <w:pPr>
+        <w:pStyle w:val="Normal"/>
+        <w:ind w:left="425" w:hanging="0"/>
+        <w:rPr>
+          <w:i/>
+          <w:i/>
+          <w:lang w:val="en-US"/>
+        </w:rPr>
+      </w:pPr>
+      <w:r>
+        <w:rPr>
+          <w:i/>
+          <w:lang w:val="en-US"/>
+        </w:rPr>
         <w:t>-pos “x:22.0;y:auto;w:450.0;p:2;f:25”</w:t>
       </w:r>
     </w:p>
@@ -6669,6 +6872,30 @@
       <w:r>
         <w:rPr/>
         <w:t xml:space="preserve"> gibt dabei die Seite an, auf welcher der Signaturblock angebracht werden soll.  Eine gültige Seitenzahl als Parameter bedeutet, dass der Signaturblock auf der angegebenen Seite absolut positioniert wird. </w:t>
+      </w:r>
+      <w:r>
+        <w:rPr>
+          <w:i/>
+        </w:rPr>
+        <w:t>p=</w:t>
+      </w:r>
+      <w:r>
+        <w:rPr>
+          <w:i/>
+        </w:rPr>
+        <w:t>last</w:t>
+      </w:r>
+      <w:r>
+        <w:rPr/>
+        <w:t xml:space="preserve"> bedeutet, dass auf </w:t>
+      </w:r>
+      <w:r>
+        <w:rPr/>
+        <w:t xml:space="preserve">der letzten Seite des Dokument </w:t>
+      </w:r>
+      <w:r>
+        <w:rPr/>
+        <w:t xml:space="preserve">eine absolute Positionierung vorgenommen wird. </w:t>
       </w:r>
       <w:r>
         <w:rPr>
@@ -6931,8 +7158,8 @@
         <w:pStyle w:val="Berschrift3"/>
         <w:rPr/>
       </w:pPr>
-      <w:bookmarkStart w:id="35" w:name="_Toc490637494"/>
-      <w:bookmarkStart w:id="36" w:name="_Toc283915534"/>
+      <w:bookmarkStart w:id="35" w:name="_Toc283915534"/>
+      <w:bookmarkStart w:id="36" w:name="_Toc490637494"/>
       <w:r>
         <w:rPr/>
         <w:t>Dynamische Werte in der Signaturblockdefinition</w:t>
@@ -7057,10 +7284,10 @@
         <w:pStyle w:val="Berschrift2"/>
         <w:rPr/>
       </w:pPr>
-      <w:bookmarkStart w:id="37" w:name="_Toc283915527"/>
-      <w:bookmarkStart w:id="38" w:name="_Toc490637495"/>
-      <w:bookmarkStart w:id="39" w:name="_Ref379288511"/>
-      <w:bookmarkStart w:id="40" w:name="_Toc379351824"/>
+      <w:bookmarkStart w:id="37" w:name="_Toc379351824"/>
+      <w:bookmarkStart w:id="38" w:name="_Ref379288511"/>
+      <w:bookmarkStart w:id="39" w:name="_Toc490637495"/>
+      <w:bookmarkStart w:id="40" w:name="_Toc283915527"/>
       <w:r>
         <w:rPr/>
         <w:t>Signatur-Platzhalter im Dokument</w:t>
@@ -7085,8 +7312,8 @@
         <w:pStyle w:val="Berschrift3"/>
         <w:rPr/>
       </w:pPr>
-      <w:bookmarkStart w:id="41" w:name="_Toc490637496"/>
-      <w:bookmarkStart w:id="42" w:name="_Toc283915528"/>
+      <w:bookmarkStart w:id="41" w:name="_Toc283915528"/>
+      <w:bookmarkStart w:id="42" w:name="_Toc490637496"/>
       <w:r>
         <w:rPr/>
         <w:t>Aktivierung</w:t>
@@ -7159,8 +7386,8 @@
         <w:pStyle w:val="Berschrift3"/>
         <w:rPr/>
       </w:pPr>
-      <w:bookmarkStart w:id="43" w:name="_Toc490637497"/>
-      <w:bookmarkStart w:id="44" w:name="_Toc283915529"/>
+      <w:bookmarkStart w:id="43" w:name="_Toc283915529"/>
+      <w:bookmarkStart w:id="44" w:name="_Toc490637497"/>
       <w:r>
         <w:rPr/>
         <w:t>QR-Code Generierung</w:t>
@@ -7256,8 +7483,8 @@
         <w:pStyle w:val="Berschrift3"/>
         <w:rPr/>
       </w:pPr>
-      <w:bookmarkStart w:id="45" w:name="_Toc490637498"/>
-      <w:bookmarkStart w:id="46" w:name="_Toc283915530"/>
+      <w:bookmarkStart w:id="45" w:name="_Toc283915530"/>
+      <w:bookmarkStart w:id="46" w:name="_Toc490637498"/>
       <w:r>
         <w:rPr/>
         <w:t>Properties</w:t>
@@ -7422,13 +7649,7 @@
         <w:rPr>
           <w:i/>
         </w:rPr>
-        <w:t>placeholder_profile_overwrite=</w:t>
-      </w:r>
-      <w:r>
-        <w:rPr>
-          <w:i/>
-        </w:rPr>
-        <w:t>false</w:t>
+        <w:t>placeholder_profile_overwrite=false</w:t>
       </w:r>
       <w:r>
         <w:rPr>
@@ -7447,34 +7668,11 @@
           <w:szCs w:val="22"/>
           <w:lang w:val="de-DE" w:eastAsia="ja-JP" w:bidi="ar-SA"/>
         </w:rPr>
-        <w:t>deak</w:t>
-      </w:r>
-      <w:r>
-        <w:rPr>
-          <w:rFonts w:eastAsia="" w:cs=""/>
-          <w:color w:val="000000" w:themeColor="text1"/>
-          <w:kern w:val="0"/>
-          <w:sz w:val="22"/>
-          <w:szCs w:val="22"/>
-          <w:lang w:val="de-DE" w:eastAsia="ja-JP" w:bidi="ar-SA"/>
-        </w:rPr>
-        <w:t>tiviert</w:t>
-      </w:r>
-      <w:r>
-        <w:rPr/>
-        <w:t xml:space="preserve"> </w:t>
-      </w:r>
-      <w:r>
-        <w:rPr/>
-        <w:t xml:space="preserve">serverseitig </w:t>
-      </w:r>
-      <w:r>
-        <w:rPr/>
-        <w:t xml:space="preserve">die </w:t>
-      </w:r>
-      <w:r>
-        <w:rPr/>
-        <w:t xml:space="preserve">Übername von Signaturprofilen (z.B. </w:t>
+        <w:t>deaktiviert</w:t>
+      </w:r>
+      <w:r>
+        <w:rPr/>
+        <w:t xml:space="preserve"> serverseitig die Übername von Signaturprofilen (z.B. </w:t>
       </w:r>
       <w:r>
         <w:rPr>
@@ -7485,11 +7683,7 @@
       </w:r>
       <w:r>
         <w:rPr/>
-        <w:t>) aus Platzhalterinformationen</w:t>
-      </w:r>
-      <w:r>
-        <w:rPr/>
-        <w:t xml:space="preserve">. Der Standardwert für diesen Parameter ist </w:t>
+        <w:t xml:space="preserve">) aus Platzhalterinformationen. Der Standardwert für diesen Parameter ist </w:t>
       </w:r>
       <w:r>
         <w:rPr>
@@ -9207,6 +9401,144 @@
                 <w:lang w:eastAsia="ja-JP" w:bidi="ar-SA"/>
               </w:rPr>
               <w:t>Platzhalter updates</w:t>
+            </w:r>
+          </w:p>
+        </w:tc>
+      </w:tr>
+      <w:tr>
+        <w:trPr/>
+        <w:tc>
+          <w:tcPr>
+            <w:tcW w:w="1251" w:type="dxa"/>
+            <w:cnfStyle w:val="001000000000" w:firstRow="0" w:lastRow="0" w:firstColumn="1" w:lastColumn="0" w:oddVBand="0" w:evenVBand="0" w:oddHBand="0" w:evenHBand="0" w:firstRowFirstColumn="0" w:firstRowLastColumn="0" w:lastRowFirstColumn="0" w:lastRowLastColumn="0"/>
+            <w:tcBorders>
+              <w:top w:val="nil"/>
+            </w:tcBorders>
+            <w:shd w:color="auto" w:fill="DDDBD5" w:themeFill="text2" w:themeFillTint="33" w:val="clear"/>
+          </w:tcPr>
+          <w:p>
+            <w:pPr>
+              <w:pStyle w:val="Normal"/>
+              <w:widowControl w:val="false"/>
+              <w:suppressAutoHyphens w:val="true"/>
+              <w:spacing w:lineRule="auto" w:line="240" w:before="60" w:after="60"/>
+              <w:rPr>
+                <w:rFonts w:eastAsia="" w:cs=""/>
+                <w:kern w:val="0"/>
+                <w:lang w:eastAsia="ja-JP" w:bidi="ar-SA"/>
+              </w:rPr>
+            </w:pPr>
+            <w:r>
+              <w:rPr>
+                <w:rFonts w:eastAsia="" w:cs=""/>
+                <w:kern w:val="0"/>
+                <w:lang w:eastAsia="ja-JP" w:bidi="ar-SA"/>
+              </w:rPr>
+              <w:t>1.2.1</w:t>
+            </w:r>
+          </w:p>
+        </w:tc>
+        <w:tc>
+          <w:tcPr>
+            <w:tcW w:w="1697" w:type="dxa"/>
+            <w:tcBorders>
+              <w:top w:val="nil"/>
+            </w:tcBorders>
+            <w:shd w:color="auto" w:fill="DDDBD5" w:themeFill="text2" w:themeFillTint="33" w:val="clear"/>
+          </w:tcPr>
+          <w:p>
+            <w:pPr>
+              <w:pStyle w:val="Normal"/>
+              <w:widowControl w:val="false"/>
+              <w:suppressAutoHyphens w:val="true"/>
+              <w:spacing w:lineRule="auto" w:line="240" w:before="60" w:after="60"/>
+              <w:cnfStyle w:val="000000000000" w:firstRow="0" w:lastRow="0" w:firstColumn="0" w:lastColumn="0" w:oddVBand="0" w:evenVBand="0" w:oddHBand="0" w:evenHBand="0" w:firstRowFirstColumn="0" w:firstRowLastColumn="0" w:lastRowFirstColumn="0" w:lastRowLastColumn="0"/>
+              <w:rPr>
+                <w:rFonts w:eastAsia="" w:cs=""/>
+                <w:kern w:val="0"/>
+                <w:lang w:eastAsia="ja-JP" w:bidi="ar-SA"/>
+              </w:rPr>
+            </w:pPr>
+            <w:r>
+              <w:rPr>
+                <w:rFonts w:eastAsia="" w:cs=""/>
+                <w:kern w:val="0"/>
+                <w:lang w:eastAsia="ja-JP" w:bidi="ar-SA"/>
+              </w:rPr>
+              <w:t>12.03.2024</w:t>
+            </w:r>
+          </w:p>
+        </w:tc>
+        <w:tc>
+          <w:tcPr>
+            <w:tcW w:w="2554" w:type="dxa"/>
+            <w:tcBorders>
+              <w:top w:val="nil"/>
+            </w:tcBorders>
+            <w:shd w:color="auto" w:fill="DDDBD5" w:themeFill="text2" w:themeFillTint="33" w:val="clear"/>
+          </w:tcPr>
+          <w:p>
+            <w:pPr>
+              <w:pStyle w:val="Normal"/>
+              <w:widowControl w:val="false"/>
+              <w:suppressAutoHyphens w:val="true"/>
+              <w:spacing w:lineRule="auto" w:line="240" w:before="60" w:after="60"/>
+              <w:cnfStyle w:val="000000000000" w:firstRow="0" w:lastRow="0" w:firstColumn="0" w:lastColumn="0" w:oddVBand="0" w:evenVBand="0" w:oddHBand="0" w:evenHBand="0" w:firstRowFirstColumn="0" w:firstRowLastColumn="0" w:lastRowFirstColumn="0" w:lastRowLastColumn="0"/>
+              <w:rPr>
+                <w:rFonts w:eastAsia="" w:cs=""/>
+                <w:kern w:val="0"/>
+                <w:lang w:eastAsia="ja-JP" w:bidi="ar-SA"/>
+              </w:rPr>
+            </w:pPr>
+            <w:r>
+              <w:rPr>
+                <w:rFonts w:eastAsia="" w:cs=""/>
+                <w:kern w:val="0"/>
+                <w:lang w:eastAsia="ja-JP" w:bidi="ar-SA"/>
+              </w:rPr>
+              <w:t>Thomas Lenz</w:t>
+            </w:r>
+          </w:p>
+        </w:tc>
+        <w:tc>
+          <w:tcPr>
+            <w:tcW w:w="3644" w:type="dxa"/>
+            <w:tcBorders>
+              <w:top w:val="nil"/>
+            </w:tcBorders>
+            <w:shd w:color="auto" w:fill="DDDBD5" w:themeFill="text2" w:themeFillTint="33" w:val="clear"/>
+          </w:tcPr>
+          <w:p>
+            <w:pPr>
+              <w:pStyle w:val="Normal"/>
+              <w:widowControl w:val="false"/>
+              <w:suppressAutoHyphens w:val="true"/>
+              <w:spacing w:lineRule="auto" w:line="240" w:before="60" w:after="60"/>
+              <w:cnfStyle w:val="000000010000" w:firstRow="0" w:lastRow="0" w:firstColumn="0" w:lastColumn="0" w:oddVBand="0" w:evenVBand="0" w:oddHBand="0" w:evenHBand="1" w:firstRowFirstColumn="0" w:firstRowLastColumn="0" w:lastRowFirstColumn="0" w:lastRowLastColumn="0"/>
+              <w:rPr>
+                <w:rFonts w:eastAsia="" w:cs=""/>
+                <w:kern w:val="0"/>
+                <w:lang w:eastAsia="ja-JP" w:bidi="ar-SA"/>
+              </w:rPr>
+            </w:pPr>
+            <w:r>
+              <w:rPr>
+                <w:rFonts w:eastAsia="" w:cs=""/>
+                <w:kern w:val="0"/>
+                <w:lang w:eastAsia="ja-JP" w:bidi="ar-SA"/>
+              </w:rPr>
+              <w:t>Page-Po</w:t>
+            </w:r>
+            <w:r>
+              <w:rPr>
+                <w:rFonts w:eastAsia="" w:cs=""/>
+                <w:color w:val="000000" w:themeColor="text1"/>
+                <w:kern w:val="0"/>
+                <w:sz w:val="22"/>
+                <w:szCs w:val="22"/>
+                <w:lang w:val="de-DE" w:eastAsia="ja-JP" w:bidi="ar-SA"/>
+              </w:rPr>
+              <w:t>sitionierung ‚last‘ hinzugefügt</w:t>
             </w:r>
           </w:p>
         </w:tc>

</xml_diff>

<commit_message>
doc(core): make final updates on handbook for next version
</commit_message>
<xml_diff>
--- a/doc/PDFAS4_Dokumentation.docx
+++ b/doc/PDFAS4_Dokumentation.docx
@@ -500,7 +500,7 @@
                 <w:kern w:val="0"/>
                 <w:lang w:eastAsia="ja-JP" w:bidi="ar-SA"/>
               </w:rPr>
-              <w:t>Version 1.2.</w:t>
+              <w:t xml:space="preserve">Version 1.2.1, </w:t>
             </w:r>
             <w:r>
               <w:rPr>
@@ -508,7 +508,7 @@
                 <w:kern w:val="0"/>
                 <w:lang w:eastAsia="ja-JP" w:bidi="ar-SA"/>
               </w:rPr>
-              <w:t>1</w:t>
+              <w:t>22</w:t>
             </w:r>
             <w:r>
               <w:rPr>
@@ -516,47 +516,7 @@
                 <w:kern w:val="0"/>
                 <w:lang w:eastAsia="ja-JP" w:bidi="ar-SA"/>
               </w:rPr>
-              <w:t xml:space="preserve">, </w:t>
-            </w:r>
-            <w:r>
-              <w:rPr>
-                <w:rFonts w:eastAsia="" w:cs=""/>
-                <w:kern w:val="0"/>
-                <w:lang w:eastAsia="ja-JP" w:bidi="ar-SA"/>
-              </w:rPr>
-              <w:t>12</w:t>
-            </w:r>
-            <w:r>
-              <w:rPr>
-                <w:rFonts w:eastAsia="" w:cs=""/>
-                <w:kern w:val="0"/>
-                <w:lang w:eastAsia="ja-JP" w:bidi="ar-SA"/>
-              </w:rPr>
-              <w:t>.</w:t>
-            </w:r>
-            <w:r>
-              <w:rPr>
-                <w:rFonts w:eastAsia="" w:cs=""/>
-                <w:kern w:val="0"/>
-                <w:lang w:eastAsia="ja-JP" w:bidi="ar-SA"/>
-              </w:rPr>
-              <w:t>03</w:t>
-            </w:r>
-            <w:r>
-              <w:rPr>
-                <w:rFonts w:eastAsia="" w:cs=""/>
-                <w:kern w:val="0"/>
-                <w:lang w:eastAsia="ja-JP" w:bidi="ar-SA"/>
-              </w:rPr>
-              <w:t>.202</w:t>
-            </w:r>
-            <w:r>
-              <w:rPr>
-                <w:rFonts w:eastAsia="" w:cs=""/>
-                <w:kern w:val="0"/>
-                <w:lang w:eastAsia="ja-JP" w:bidi="ar-SA"/>
-              </w:rPr>
-              <w:t>4</w:t>
+              <w:t>.03.2024</w:t>
             </w:r>
           </w:p>
         </w:tc>
@@ -2279,9 +2239,9 @@
         <w:pStyle w:val="Berschrift1"/>
         <w:rPr/>
       </w:pPr>
-      <w:bookmarkStart w:id="0" w:name="_Toc379351812"/>
+      <w:bookmarkStart w:id="0" w:name="_Toc490637480"/>
       <w:bookmarkStart w:id="1" w:name="_Toc129153041"/>
-      <w:bookmarkStart w:id="2" w:name="_Toc490637480"/>
+      <w:bookmarkStart w:id="2" w:name="_Toc379351812"/>
       <w:r>
         <w:rPr/>
         <w:t>Kurzbeschreibung</w:t>
@@ -2318,9 +2278,9 @@
         <w:pStyle w:val="Berschrift1"/>
         <w:rPr/>
       </w:pPr>
-      <w:bookmarkStart w:id="3" w:name="_Toc129153045"/>
+      <w:bookmarkStart w:id="3" w:name="_Toc490637481"/>
       <w:bookmarkStart w:id="4" w:name="_Toc379351813"/>
-      <w:bookmarkStart w:id="5" w:name="_Toc490637481"/>
+      <w:bookmarkStart w:id="5" w:name="_Toc129153045"/>
       <w:r>
         <w:rPr/>
         <w:t>Anwendungsbeschreibung</w:t>
@@ -2413,8 +2373,8 @@
         <w:pStyle w:val="Berschrift2"/>
         <w:rPr/>
       </w:pPr>
-      <w:bookmarkStart w:id="6" w:name="_Toc379351814"/>
-      <w:bookmarkStart w:id="7" w:name="_Toc490637482"/>
+      <w:bookmarkStart w:id="6" w:name="_Toc490637482"/>
+      <w:bookmarkStart w:id="7" w:name="_Toc379351814"/>
       <w:r>
         <w:rPr/>
         <w:t>PDF-AS Java Bibliothek</w:t>
@@ -2734,8 +2694,8 @@
         <w:pStyle w:val="Berschrift2"/>
         <w:rPr/>
       </w:pPr>
-      <w:bookmarkStart w:id="8" w:name="_Toc379351815"/>
-      <w:bookmarkStart w:id="9" w:name="_Toc490637483"/>
+      <w:bookmarkStart w:id="8" w:name="_Toc490637483"/>
+      <w:bookmarkStart w:id="9" w:name="_Toc379351815"/>
       <w:r>
         <w:rPr/>
         <w:t>PDF-AS Kommandozeilen Anwendung</w:t>
@@ -3513,19 +3473,7 @@
               <w:rPr>
                 <w:lang w:val="de-DE"/>
               </w:rPr>
-              <w:t>p_algo: „auto“, „new“, „</w:t>
-            </w:r>
-            <w:r>
-              <w:rPr>
-                <w:lang w:val="de-DE"/>
-              </w:rPr>
-              <w:t>last“,</w:t>
-            </w:r>
-            <w:r>
-              <w:rPr>
-                <w:lang w:val="de-DE"/>
-              </w:rPr>
-              <w:t xml:space="preserve"> </w:t>
+              <w:t xml:space="preserve">p_algo: „auto“, „new“, „last“, </w:t>
             </w:r>
             <w:r>
               <w:rPr>
@@ -4164,8 +4112,8 @@
         <w:pStyle w:val="Berschrift2"/>
         <w:rPr/>
       </w:pPr>
-      <w:bookmarkStart w:id="10" w:name="_Toc379351816"/>
-      <w:bookmarkStart w:id="11" w:name="_Toc490637484"/>
+      <w:bookmarkStart w:id="10" w:name="_Toc490637484"/>
+      <w:bookmarkStart w:id="11" w:name="_Toc379351816"/>
       <w:r>
         <w:rPr/>
         <w:t>PDF-AS Webanwendung</w:t>
@@ -4221,8 +4169,8 @@
         <w:pStyle w:val="Berschrift1"/>
         <w:rPr/>
       </w:pPr>
-      <w:bookmarkStart w:id="12" w:name="_Toc379351817"/>
-      <w:bookmarkStart w:id="13" w:name="_Toc490637485"/>
+      <w:bookmarkStart w:id="12" w:name="_Toc490637485"/>
+      <w:bookmarkStart w:id="13" w:name="_Toc379351817"/>
       <w:r>
         <w:rPr/>
         <w:t>Konfiguration</w:t>
@@ -4245,8 +4193,8 @@
         <w:pStyle w:val="Berschrift2"/>
         <w:rPr/>
       </w:pPr>
-      <w:bookmarkStart w:id="14" w:name="_Toc379351818"/>
-      <w:bookmarkStart w:id="15" w:name="_Toc490637486"/>
+      <w:bookmarkStart w:id="14" w:name="_Toc490637486"/>
+      <w:bookmarkStart w:id="15" w:name="_Toc379351818"/>
       <w:r>
         <w:rPr/>
         <w:t>Grundsätzliches</w:t>
@@ -4386,8 +4334,8 @@
         <w:pStyle w:val="Berschrift2"/>
         <w:rPr/>
       </w:pPr>
-      <w:bookmarkStart w:id="16" w:name="_Toc379351819"/>
-      <w:bookmarkStart w:id="17" w:name="_Toc490637487"/>
+      <w:bookmarkStart w:id="16" w:name="_Toc490637487"/>
+      <w:bookmarkStart w:id="17" w:name="_Toc379351819"/>
       <w:r>
         <w:rPr/>
         <w:t>Basiseinstellungen für die Anbindung an die Bürgerkartenumgebung (BKU)</w:t>
@@ -4452,8 +4400,8 @@
         <w:pStyle w:val="Berschrift2"/>
         <w:rPr/>
       </w:pPr>
-      <w:bookmarkStart w:id="18" w:name="_Toc379351820"/>
-      <w:bookmarkStart w:id="19" w:name="_Toc490637488"/>
+      <w:bookmarkStart w:id="18" w:name="_Toc490637488"/>
+      <w:bookmarkStart w:id="19" w:name="_Toc379351820"/>
       <w:r>
         <w:rPr/>
         <w:t>Basiseinstellungen für die Anbindung an MOA-SS und MOA SP</w:t>
@@ -4619,8 +4567,8 @@
         <w:pStyle w:val="Berschrift2"/>
         <w:rPr/>
       </w:pPr>
-      <w:bookmarkStart w:id="20" w:name="_Toc379351821"/>
-      <w:bookmarkStart w:id="21" w:name="_Toc490637489"/>
+      <w:bookmarkStart w:id="20" w:name="_Toc490637489"/>
+      <w:bookmarkStart w:id="21" w:name="_Toc379351821"/>
       <w:r>
         <w:rPr/>
         <w:t>Basiseinstellungen für die Anbindung von MOCCA Online</w:t>
@@ -4674,8 +4622,8 @@
         <w:pStyle w:val="Berschrift2"/>
         <w:rPr/>
       </w:pPr>
-      <w:bookmarkStart w:id="22" w:name="_Toc379351822"/>
-      <w:bookmarkStart w:id="23" w:name="_Toc490637490"/>
+      <w:bookmarkStart w:id="22" w:name="_Toc490637490"/>
+      <w:bookmarkStart w:id="23" w:name="_Toc379351822"/>
       <w:r>
         <w:rPr/>
         <w:t>Basiseinstellungen für die Anbindung der Handy Signatur</w:t>
@@ -4723,10 +4671,10 @@
         <w:pStyle w:val="Berschrift2"/>
         <w:rPr/>
       </w:pPr>
-      <w:bookmarkStart w:id="24" w:name="_Toc379351823"/>
-      <w:bookmarkStart w:id="25" w:name="_Toc283915519"/>
-      <w:bookmarkStart w:id="26" w:name="_Toc147482732"/>
-      <w:bookmarkStart w:id="27" w:name="_Toc490637491"/>
+      <w:bookmarkStart w:id="24" w:name="_Toc490637491"/>
+      <w:bookmarkStart w:id="25" w:name="_Toc147482732"/>
+      <w:bookmarkStart w:id="26" w:name="_Toc283915519"/>
+      <w:bookmarkStart w:id="27" w:name="_Toc379351823"/>
       <w:r>
         <w:rPr/>
         <w:t>Spezifikation der Signatur Blöcke</w:t>
@@ -4935,9 +4883,9 @@
         <w:pStyle w:val="Berschrift3"/>
         <w:rPr/>
       </w:pPr>
-      <w:bookmarkStart w:id="28" w:name="_Toc147482733"/>
+      <w:bookmarkStart w:id="28" w:name="_Toc490637492"/>
       <w:bookmarkStart w:id="29" w:name="_Toc283915520"/>
-      <w:bookmarkStart w:id="30" w:name="_Toc490637492"/>
+      <w:bookmarkStart w:id="30" w:name="_Toc147482733"/>
       <w:r>
         <w:rPr/>
         <w:t>Design des Signatur Blocks (Tabelle)</w:t>
@@ -5703,9 +5651,9 @@
         <w:pStyle w:val="Berschrift3"/>
         <w:rPr/>
       </w:pPr>
-      <w:bookmarkStart w:id="31" w:name="_Toc147482735"/>
+      <w:bookmarkStart w:id="31" w:name="_Toc490637493"/>
       <w:bookmarkStart w:id="32" w:name="_Toc283915522"/>
-      <w:bookmarkStart w:id="33" w:name="_Toc490637493"/>
+      <w:bookmarkStart w:id="33" w:name="_Toc147482735"/>
       <w:r>
         <w:rPr/>
         <w:t>Positionierung von Signaturblöcken</w:t>
@@ -6159,19 +6107,25 @@
         <w:rPr>
           <w:i/>
         </w:rPr>
-        <w:t>(</w:t>
-      </w:r>
-      <w:r>
-        <w:rPr>
-          <w:i/>
-        </w:rPr>
-        <w:t xml:space="preserve">letzte Seite </w:t>
-      </w:r>
-      <w:r>
-        <w:rPr>
-          <w:i/>
-        </w:rPr>
-        <w:t>oder neue Seite die letzte Seite zu wenig freie Fläche aufweist)</w:t>
+        <w:t xml:space="preserve">am Ende des Dokuments </w:t>
+      </w:r>
+      <w:r>
+        <w:rPr>
+          <w:i/>
+        </w:rPr>
+        <w:t xml:space="preserve">(letzte Seite oder neue Seite </w:t>
+      </w:r>
+      <w:r>
+        <w:rPr>
+          <w:i/>
+        </w:rPr>
+        <w:t xml:space="preserve">falls </w:t>
+      </w:r>
+      <w:r>
+        <w:rPr>
+          <w:i/>
+        </w:rPr>
+        <w:t>die letzte Seite zu wenig freie Fläche aufweist)</w:t>
       </w:r>
     </w:p>
     <w:p>
@@ -6193,7 +6147,7 @@
         <w:rPr>
           <w:i/>
         </w:rPr>
-        <w:t>:=  'new'  ... Neue Seite am Ende des Dokumentes</w:t>
+        <w:t>:=  'new'  ... Neue Seite am Ende des Dokuments</w:t>
       </w:r>
     </w:p>
     <w:p>
@@ -6215,25 +6169,7 @@
         <w:rPr>
           <w:i/>
         </w:rPr>
-        <w:t>:=  '</w:t>
-      </w:r>
-      <w:r>
-        <w:rPr>
-          <w:i/>
-        </w:rPr>
-        <w:t>last</w:t>
-      </w:r>
-      <w:r>
-        <w:rPr>
-          <w:i/>
-        </w:rPr>
-        <w:t xml:space="preserve">'  ... </w:t>
-      </w:r>
-      <w:r>
-        <w:rPr>
-          <w:i/>
-        </w:rPr>
-        <w:t>Letzte Seite des Dokuments</w:t>
+        <w:t>:=  'last'  ... Letzte Seite des Dokuments</w:t>
       </w:r>
     </w:p>
     <w:p>
@@ -6650,49 +6586,61 @@
           <w:i/>
           <w:lang w:val="en-US"/>
         </w:rPr>
-        <w:t>-pos “x:</w:t>
-      </w:r>
-      <w:r>
-        <w:rPr>
+        <w:t>-pos “x:auto;y:10.0;w:auto;p:last”</w:t>
+      </w:r>
+    </w:p>
+    <w:p>
+      <w:pPr>
+        <w:pStyle w:val="Normal"/>
+        <w:ind w:left="425" w:hanging="0"/>
+        <w:rPr>
+          <w:i/>
           <w:i/>
           <w:lang w:val="en-US"/>
         </w:rPr>
-        <w:t>auto</w:t>
-      </w:r>
+      </w:pPr>
       <w:r>
         <w:rPr>
           <w:i/>
           <w:lang w:val="en-US"/>
         </w:rPr>
-        <w:t>;y:10.0;w:</w:t>
-      </w:r>
-      <w:r>
-        <w:rPr>
+        <w:t>-pos “x:auto;y:auto;p:last”</w:t>
+      </w:r>
+    </w:p>
+    <w:p>
+      <w:pPr>
+        <w:pStyle w:val="Normal"/>
+        <w:ind w:left="425" w:hanging="0"/>
+        <w:rPr>
+          <w:i/>
           <w:i/>
           <w:lang w:val="en-US"/>
         </w:rPr>
-        <w:t>auto</w:t>
-      </w:r>
+      </w:pPr>
       <w:r>
         <w:rPr>
           <w:i/>
           <w:lang w:val="en-US"/>
         </w:rPr>
-        <w:t>;p:</w:t>
-      </w:r>
-      <w:r>
-        <w:rPr>
+        <w:t>-pos “x:22.0;y:auto;w:450.0;p:2;f:25”</w:t>
+      </w:r>
+    </w:p>
+    <w:p>
+      <w:pPr>
+        <w:pStyle w:val="Normal"/>
+        <w:ind w:left="425" w:hanging="0"/>
+        <w:rPr>
+          <w:i/>
           <w:i/>
           <w:lang w:val="en-US"/>
         </w:rPr>
-        <w:t>last</w:t>
-      </w:r>
+      </w:pPr>
       <w:r>
         <w:rPr>
           <w:i/>
           <w:lang w:val="en-US"/>
         </w:rPr>
-        <w:t>”</w:t>
+        <w:t>-pos “x:auto;y:auto;w:auto;p:auto;f:25.0”</w:t>
       </w:r>
     </w:p>
     <w:p>
@@ -6710,49 +6658,25 @@
           <w:i/>
           <w:lang w:val="en-US"/>
         </w:rPr>
-        <w:t>-pos “x:</w:t>
-      </w:r>
-      <w:r>
-        <w:rPr>
+        <w:t>-pos “f:25.0”</w:t>
+      </w:r>
+    </w:p>
+    <w:p>
+      <w:pPr>
+        <w:pStyle w:val="Normal"/>
+        <w:ind w:left="425" w:hanging="0"/>
+        <w:rPr>
+          <w:i/>
           <w:i/>
           <w:lang w:val="en-US"/>
         </w:rPr>
-        <w:t>auto</w:t>
-      </w:r>
+      </w:pPr>
       <w:r>
         <w:rPr>
           <w:i/>
           <w:lang w:val="en-US"/>
         </w:rPr>
-        <w:t>;y:</w:t>
-      </w:r>
-      <w:r>
-        <w:rPr>
-          <w:i/>
-          <w:lang w:val="en-US"/>
-        </w:rPr>
-        <w:t>auto</w:t>
-      </w:r>
-      <w:r>
-        <w:rPr>
-          <w:i/>
-          <w:lang w:val="en-US"/>
-        </w:rPr>
-        <w:t>;p:</w:t>
-      </w:r>
-      <w:r>
-        <w:rPr>
-          <w:i/>
-          <w:lang w:val="en-US"/>
-        </w:rPr>
-        <w:t>last</w:t>
-      </w:r>
-      <w:r>
-        <w:rPr>
-          <w:i/>
-          <w:lang w:val="en-US"/>
-        </w:rPr>
-        <w:t>”</w:t>
+        <w:t>-pos “x:150;y:22;w:400”</w:t>
       </w:r>
     </w:p>
     <w:p>
@@ -6762,78 +6686,6 @@
         <w:rPr>
           <w:i/>
           <w:i/>
-          <w:lang w:val="en-US"/>
-        </w:rPr>
-      </w:pPr>
-      <w:r>
-        <w:rPr>
-          <w:i/>
-          <w:lang w:val="en-US"/>
-        </w:rPr>
-        <w:t>-pos “x:22.0;y:auto;w:450.0;p:2;f:25”</w:t>
-      </w:r>
-    </w:p>
-    <w:p>
-      <w:pPr>
-        <w:pStyle w:val="Normal"/>
-        <w:ind w:left="425" w:hanging="0"/>
-        <w:rPr>
-          <w:i/>
-          <w:i/>
-          <w:lang w:val="en-US"/>
-        </w:rPr>
-      </w:pPr>
-      <w:r>
-        <w:rPr>
-          <w:i/>
-          <w:lang w:val="en-US"/>
-        </w:rPr>
-        <w:t>-pos “x:auto;y:auto;w:auto;p:auto;f:25.0”</w:t>
-      </w:r>
-    </w:p>
-    <w:p>
-      <w:pPr>
-        <w:pStyle w:val="Normal"/>
-        <w:ind w:left="425" w:hanging="0"/>
-        <w:rPr>
-          <w:i/>
-          <w:i/>
-          <w:lang w:val="en-US"/>
-        </w:rPr>
-      </w:pPr>
-      <w:r>
-        <w:rPr>
-          <w:i/>
-          <w:lang w:val="en-US"/>
-        </w:rPr>
-        <w:t>-pos “f:25.0”</w:t>
-      </w:r>
-    </w:p>
-    <w:p>
-      <w:pPr>
-        <w:pStyle w:val="Normal"/>
-        <w:ind w:left="425" w:hanging="0"/>
-        <w:rPr>
-          <w:i/>
-          <w:i/>
-          <w:lang w:val="en-US"/>
-        </w:rPr>
-      </w:pPr>
-      <w:r>
-        <w:rPr>
-          <w:i/>
-          <w:lang w:val="en-US"/>
-        </w:rPr>
-        <w:t>-pos “x:150;y:22;w:400”</w:t>
-      </w:r>
-    </w:p>
-    <w:p>
-      <w:pPr>
-        <w:pStyle w:val="Normal"/>
-        <w:ind w:left="425" w:hanging="0"/>
-        <w:rPr>
-          <w:i/>
-          <w:i/>
           <w:lang w:val="de-AT"/>
         </w:rPr>
       </w:pPr>
@@ -6877,25 +6729,11 @@
         <w:rPr>
           <w:i/>
         </w:rPr>
-        <w:t>p=</w:t>
-      </w:r>
-      <w:r>
-        <w:rPr>
-          <w:i/>
-        </w:rPr>
-        <w:t>last</w:t>
-      </w:r>
-      <w:r>
-        <w:rPr/>
-        <w:t xml:space="preserve"> bedeutet, dass auf </w:t>
-      </w:r>
-      <w:r>
-        <w:rPr/>
-        <w:t xml:space="preserve">der letzten Seite des Dokument </w:t>
-      </w:r>
-      <w:r>
-        <w:rPr/>
-        <w:t xml:space="preserve">eine absolute Positionierung vorgenommen wird. </w:t>
+        <w:t>p=last</w:t>
+      </w:r>
+      <w:r>
+        <w:rPr/>
+        <w:t xml:space="preserve"> bedeutet, dass auf der letzten Seite des Dokument eine absolute Positionierung vorgenommen wird. </w:t>
       </w:r>
       <w:r>
         <w:rPr>
@@ -7158,8 +6996,8 @@
         <w:pStyle w:val="Berschrift3"/>
         <w:rPr/>
       </w:pPr>
-      <w:bookmarkStart w:id="35" w:name="_Toc283915534"/>
-      <w:bookmarkStart w:id="36" w:name="_Toc490637494"/>
+      <w:bookmarkStart w:id="35" w:name="_Toc490637494"/>
+      <w:bookmarkStart w:id="36" w:name="_Toc283915534"/>
       <w:r>
         <w:rPr/>
         <w:t>Dynamische Werte in der Signaturblockdefinition</w:t>
@@ -7284,10 +7122,10 @@
         <w:pStyle w:val="Berschrift2"/>
         <w:rPr/>
       </w:pPr>
-      <w:bookmarkStart w:id="37" w:name="_Toc379351824"/>
-      <w:bookmarkStart w:id="38" w:name="_Ref379288511"/>
-      <w:bookmarkStart w:id="39" w:name="_Toc490637495"/>
-      <w:bookmarkStart w:id="40" w:name="_Toc283915527"/>
+      <w:bookmarkStart w:id="37" w:name="_Toc283915527"/>
+      <w:bookmarkStart w:id="38" w:name="_Toc490637495"/>
+      <w:bookmarkStart w:id="39" w:name="_Ref379288511"/>
+      <w:bookmarkStart w:id="40" w:name="_Toc379351824"/>
       <w:r>
         <w:rPr/>
         <w:t>Signatur-Platzhalter im Dokument</w:t>
@@ -7312,8 +7150,8 @@
         <w:pStyle w:val="Berschrift3"/>
         <w:rPr/>
       </w:pPr>
-      <w:bookmarkStart w:id="41" w:name="_Toc283915528"/>
-      <w:bookmarkStart w:id="42" w:name="_Toc490637496"/>
+      <w:bookmarkStart w:id="41" w:name="_Toc490637496"/>
+      <w:bookmarkStart w:id="42" w:name="_Toc283915528"/>
       <w:r>
         <w:rPr/>
         <w:t>Aktivierung</w:t>
@@ -7386,8 +7224,8 @@
         <w:pStyle w:val="Berschrift3"/>
         <w:rPr/>
       </w:pPr>
-      <w:bookmarkStart w:id="43" w:name="_Toc283915529"/>
-      <w:bookmarkStart w:id="44" w:name="_Toc490637497"/>
+      <w:bookmarkStart w:id="43" w:name="_Toc490637497"/>
+      <w:bookmarkStart w:id="44" w:name="_Toc283915529"/>
       <w:r>
         <w:rPr/>
         <w:t>QR-Code Generierung</w:t>
@@ -7483,8 +7321,8 @@
         <w:pStyle w:val="Berschrift3"/>
         <w:rPr/>
       </w:pPr>
-      <w:bookmarkStart w:id="45" w:name="_Toc283915530"/>
-      <w:bookmarkStart w:id="46" w:name="_Toc490637498"/>
+      <w:bookmarkStart w:id="45" w:name="_Toc490637498"/>
+      <w:bookmarkStart w:id="46" w:name="_Toc283915530"/>
       <w:r>
         <w:rPr/>
         <w:t>Properties</w:t>
@@ -9286,6 +9124,7 @@
             <w:cnfStyle w:val="001000000000" w:firstRow="0" w:lastRow="0" w:firstColumn="1" w:lastColumn="0" w:oddVBand="0" w:evenVBand="0" w:oddHBand="0" w:evenHBand="0" w:firstRowFirstColumn="0" w:firstRowLastColumn="0" w:lastRowFirstColumn="0" w:lastRowLastColumn="0"/>
             <w:tcBorders>
               <w:top w:val="nil"/>
+              <w:bottom w:val="nil"/>
             </w:tcBorders>
             <w:shd w:color="auto" w:fill="DDDBD5" w:themeFill="text2" w:themeFillTint="33" w:val="clear"/>
           </w:tcPr>
@@ -9316,6 +9155,7 @@
             <w:tcW w:w="1697" w:type="dxa"/>
             <w:tcBorders>
               <w:top w:val="nil"/>
+              <w:bottom w:val="nil"/>
             </w:tcBorders>
             <w:shd w:color="auto" w:fill="DDDBD5" w:themeFill="text2" w:themeFillTint="33" w:val="clear"/>
           </w:tcPr>
@@ -9347,6 +9187,7 @@
             <w:tcW w:w="2554" w:type="dxa"/>
             <w:tcBorders>
               <w:top w:val="nil"/>
+              <w:bottom w:val="nil"/>
             </w:tcBorders>
             <w:shd w:color="auto" w:fill="DDDBD5" w:themeFill="text2" w:themeFillTint="33" w:val="clear"/>
           </w:tcPr>
@@ -9378,6 +9219,7 @@
             <w:tcW w:w="3644" w:type="dxa"/>
             <w:tcBorders>
               <w:top w:val="nil"/>
+              <w:bottom w:val="nil"/>
             </w:tcBorders>
             <w:shd w:color="auto" w:fill="DDDBD5" w:themeFill="text2" w:themeFillTint="33" w:val="clear"/>
           </w:tcPr>
@@ -9465,7 +9307,15 @@
                 <w:kern w:val="0"/>
                 <w:lang w:eastAsia="ja-JP" w:bidi="ar-SA"/>
               </w:rPr>
-              <w:t>12.03.2024</w:t>
+              <w:t>22</w:t>
+            </w:r>
+            <w:r>
+              <w:rPr>
+                <w:rFonts w:eastAsia="" w:cs=""/>
+                <w:kern w:val="0"/>
+                <w:lang w:eastAsia="ja-JP" w:bidi="ar-SA"/>
+              </w:rPr>
+              <w:t>.03.2024</w:t>
             </w:r>
           </w:p>
         </w:tc>
@@ -9913,7 +9763,7 @@
                                 </w:r>
                                 <w:r>
                                   <w:rPr/>
-                                  <w:t>22</w:t>
+                                  <w:t>3</w:t>
                                 </w:r>
                                 <w:r>
                                   <w:rPr/>
@@ -10026,7 +9876,7 @@
                           </w:r>
                           <w:r>
                             <w:rPr/>
-                            <w:t>22</w:t>
+                            <w:t>3</w:t>
                           </w:r>
                           <w:r>
                             <w:rPr/>

</xml_diff>